<commit_message>
Created: NetworkManager for Leaderboard
</commit_message>
<xml_diff>
--- a/report/Computing Project Report - WONG KAI LUN.docx
+++ b/report/Computing Project Report - WONG KAI LUN.docx
@@ -5,253 +5,74 @@
     <w:p>
       <w:pPr>
         <w:pStyle w:val="Title"/>
-        <w:jc w:val="center"/>
-        <w:rPr>
-          <w:sz w:val="72"/>
-          <w:szCs w:val="72"/>
-        </w:rPr>
       </w:pPr>
     </w:p>
     <w:p>
       <w:pPr>
         <w:pStyle w:val="Title"/>
-        <w:jc w:val="center"/>
-        <w:rPr>
-          <w:sz w:val="72"/>
-          <w:szCs w:val="72"/>
-        </w:rPr>
-      </w:pPr>
-      <w:r>
-        <w:rPr>
-          <w:sz w:val="72"/>
-          <w:szCs w:val="72"/>
-        </w:rPr>
+      </w:pPr>
+      <w:r>
         <w:t>University of Plymouth</w:t>
       </w:r>
     </w:p>
-    <w:p>
-      <w:pPr>
-        <w:jc w:val="center"/>
-        <w:rPr>
-          <w:sz w:val="28"/>
-          <w:szCs w:val="28"/>
-          <w:lang w:val="en-MY"/>
-        </w:rPr>
-      </w:pPr>
-    </w:p>
-    <w:p>
-      <w:pPr>
-        <w:jc w:val="center"/>
-        <w:rPr>
-          <w:sz w:val="44"/>
-          <w:szCs w:val="44"/>
-          <w:lang w:val="en-MY"/>
-        </w:rPr>
-      </w:pPr>
-      <w:r>
-        <w:rPr>
-          <w:sz w:val="44"/>
-          <w:szCs w:val="44"/>
-          <w:lang w:val="en-MY"/>
-        </w:rPr>
+    <w:p/>
+    <w:p>
+      <w:r>
         <w:t>School of Engineering,</w:t>
       </w:r>
     </w:p>
     <w:p>
-      <w:pPr>
-        <w:jc w:val="center"/>
-        <w:rPr>
-          <w:sz w:val="44"/>
-          <w:szCs w:val="44"/>
-        </w:rPr>
-      </w:pPr>
-      <w:r>
-        <w:rPr>
-          <w:sz w:val="44"/>
-          <w:szCs w:val="44"/>
-          <w:lang w:val="en-MY"/>
-        </w:rPr>
+      <w:r>
         <w:t>Computing, and Mathematics</w:t>
       </w:r>
     </w:p>
-    <w:p>
-      <w:pPr>
-        <w:jc w:val="center"/>
-        <w:rPr>
-          <w:sz w:val="44"/>
-          <w:szCs w:val="44"/>
-          <w:lang w:val="en-MY"/>
-        </w:rPr>
-      </w:pPr>
-    </w:p>
-    <w:p>
-      <w:pPr>
-        <w:jc w:val="center"/>
-        <w:rPr>
-          <w:sz w:val="44"/>
-          <w:szCs w:val="44"/>
-          <w:lang w:val="en-MY"/>
-        </w:rPr>
-      </w:pPr>
-      <w:r>
-        <w:rPr>
-          <w:sz w:val="44"/>
-          <w:szCs w:val="44"/>
-        </w:rPr>
+    <w:p/>
+    <w:p>
+      <w:r>
         <w:t>MAL3018</w:t>
       </w:r>
     </w:p>
     <w:p>
-      <w:pPr>
-        <w:jc w:val="center"/>
-        <w:rPr>
-          <w:sz w:val="44"/>
-          <w:szCs w:val="44"/>
-          <w:lang w:val="en-MY"/>
-        </w:rPr>
-      </w:pPr>
-      <w:r>
-        <w:rPr>
-          <w:sz w:val="44"/>
-          <w:szCs w:val="44"/>
-          <w:lang w:val="en-MY"/>
-        </w:rPr>
+      <w:r>
         <w:t>Computing Project</w:t>
       </w:r>
     </w:p>
     <w:p>
-      <w:pPr>
-        <w:jc w:val="center"/>
-        <w:rPr>
-          <w:sz w:val="44"/>
-          <w:szCs w:val="44"/>
-        </w:rPr>
-      </w:pPr>
-      <w:r>
-        <w:rPr>
-          <w:sz w:val="44"/>
-          <w:szCs w:val="44"/>
-          <w:lang w:val="en-MY"/>
-        </w:rPr>
+      <w:r>
         <w:t>20</w:t>
       </w:r>
       <w:r>
-        <w:rPr>
-          <w:sz w:val="44"/>
-          <w:szCs w:val="44"/>
-        </w:rPr>
         <w:t>25</w:t>
       </w:r>
       <w:r>
-        <w:rPr>
-          <w:sz w:val="44"/>
-          <w:szCs w:val="44"/>
-          <w:lang w:val="en-MY"/>
-        </w:rPr>
         <w:t>/202</w:t>
       </w:r>
       <w:r>
-        <w:rPr>
-          <w:sz w:val="44"/>
-          <w:szCs w:val="44"/>
-        </w:rPr>
         <w:t>6</w:t>
       </w:r>
     </w:p>
-    <w:p>
-      <w:pPr>
-        <w:jc w:val="center"/>
-        <w:rPr>
-          <w:sz w:val="44"/>
-          <w:szCs w:val="44"/>
-          <w:lang w:val="en-MY"/>
-        </w:rPr>
-      </w:pPr>
-    </w:p>
-    <w:p>
-      <w:pPr>
-        <w:jc w:val="center"/>
-        <w:rPr>
-          <w:sz w:val="44"/>
-          <w:szCs w:val="44"/>
-        </w:rPr>
-      </w:pPr>
-      <w:r>
-        <w:rPr>
-          <w:sz w:val="44"/>
-          <w:szCs w:val="44"/>
-        </w:rPr>
+    <w:p/>
+    <w:p>
+      <w:r>
         <w:t>Gamified Cyber Awareness Training</w:t>
       </w:r>
     </w:p>
-    <w:p>
-      <w:pPr>
-        <w:jc w:val="center"/>
-        <w:rPr>
-          <w:sz w:val="44"/>
-          <w:szCs w:val="44"/>
-          <w:lang w:val="en-MY"/>
-        </w:rPr>
-      </w:pPr>
-    </w:p>
-    <w:p>
-      <w:pPr>
-        <w:spacing w:line="360" w:lineRule="auto"/>
-        <w:jc w:val="center"/>
-        <w:rPr>
-          <w:sz w:val="32"/>
-          <w:szCs w:val="32"/>
-          <w:lang w:val="en-MY"/>
-        </w:rPr>
-      </w:pPr>
-      <w:r>
-        <w:rPr>
-          <w:sz w:val="32"/>
-          <w:szCs w:val="32"/>
-        </w:rPr>
+    <w:p/>
+    <w:p>
+      <w:r>
         <w:t>Wong Kai Lun</w:t>
       </w:r>
     </w:p>
     <w:p>
-      <w:pPr>
-        <w:spacing w:line="360" w:lineRule="auto"/>
-        <w:jc w:val="center"/>
-        <w:rPr>
-          <w:sz w:val="32"/>
-          <w:szCs w:val="32"/>
-          <w:lang w:val="en-MY"/>
-        </w:rPr>
-      </w:pPr>
-      <w:r>
-        <w:rPr>
-          <w:sz w:val="32"/>
-          <w:szCs w:val="32"/>
-        </w:rPr>
+      <w:r>
         <w:t>BSSE2409079</w:t>
       </w:r>
     </w:p>
     <w:p>
-      <w:pPr>
-        <w:spacing w:line="360" w:lineRule="auto"/>
-        <w:jc w:val="center"/>
-        <w:rPr>
-          <w:sz w:val="32"/>
-          <w:szCs w:val="32"/>
-        </w:rPr>
-      </w:pPr>
-      <w:r>
-        <w:rPr>
-          <w:sz w:val="32"/>
-          <w:szCs w:val="32"/>
-          <w:lang w:val="en-MY"/>
-        </w:rPr>
+      <w:r>
         <w:t>BSc (Hons) Computer Science</w:t>
       </w:r>
       <w:r>
-        <w:rPr>
-          <w:sz w:val="32"/>
-          <w:szCs w:val="32"/>
-        </w:rPr>
         <w:t xml:space="preserve"> (Software Engineering)</w:t>
       </w:r>
     </w:p>
@@ -263,7 +84,6 @@
     <w:p>
       <w:pPr>
         <w:pStyle w:val="Heading1"/>
-        <w:spacing w:line="276" w:lineRule="auto"/>
       </w:pPr>
       <w:r>
         <w:lastRenderedPageBreak/>
@@ -271,10 +91,6 @@
       </w:r>
     </w:p>
     <w:p>
-      <w:pPr>
-        <w:spacing w:line="276" w:lineRule="auto"/>
-        <w:jc w:val="both"/>
-      </w:pPr>
       <w:r>
         <w:t>I would like to thank my lecturer, Mr. Eric Kong Kok Wah and</w:t>
       </w:r>
@@ -289,20 +105,11 @@
       </w:r>
     </w:p>
     <w:p>
-      <w:pPr>
-        <w:spacing w:line="276" w:lineRule="auto"/>
-        <w:jc w:val="both"/>
-      </w:pPr>
       <w:r>
         <w:t>I would also like to thank my family for their endless support, especially my brother, who took time out of his busy schedule to test my game and point out bugs I had overlooked.</w:t>
       </w:r>
     </w:p>
-    <w:p>
-      <w:pPr>
-        <w:spacing w:line="276" w:lineRule="auto"/>
-        <w:jc w:val="both"/>
-      </w:pPr>
-    </w:p>
+    <w:p/>
     <w:p>
       <w:pPr>
         <w:pStyle w:val="Heading1"/>
@@ -442,89 +249,276 @@
     <w:p>
       <w:pPr>
         <w:pStyle w:val="Heading1"/>
+      </w:pPr>
+      <w:r>
+        <w:lastRenderedPageBreak/>
+        <w:t xml:space="preserve">1. </w:t>
+      </w:r>
+      <w:r>
+        <w:t>Introduction</w:t>
+      </w:r>
+    </w:p>
+    <w:p>
+      <w:pPr>
+        <w:spacing w:after="0"/>
+      </w:pPr>
+      <w:r>
+        <w:t>In recent years, cybercrime, particularly online fraud, has increased significantly, affecting both individuals and organisations. Victims have suffered substantial financial losses due to phishing attacks, ransomware, and business email compromise (BEC) scams. Notably, many of these attacks exploit human error rather than technical vulnerabilities, relying on deceptive communication and social engineering techniques.</w:t>
+      </w:r>
+    </w:p>
+    <w:p>
+      <w:pPr>
+        <w:spacing w:after="0"/>
+      </w:pPr>
+    </w:p>
+    <w:p>
+      <w:pPr>
+        <w:spacing w:after="0"/>
+      </w:pPr>
+      <w:r>
+        <w:t>According to Malay Mail</w:t>
+      </w:r>
+      <w:r>
+        <w:t xml:space="preserve"> (202</w:t>
+      </w:r>
+      <w:r>
+        <w:t>6</w:t>
+      </w:r>
+      <w:r>
+        <w:t>)</w:t>
+      </w:r>
+      <w:r>
+        <w:t>, Malaysia recorded losses of up to RM2.77 billion from online fraud in 2025, the highest in the past three years. In comparison, losses were reported at RM1.28 billion in 2023 and RM1.56 billion in 2024. In addition, New Straits Times</w:t>
+      </w:r>
+      <w:r>
+        <w:t xml:space="preserve"> (2026)</w:t>
+      </w:r>
+      <w:r>
+        <w:t xml:space="preserve"> reported a case in Tangkak, Johor, where an employee was deceived by subtle alterations to a supplier’s email address, resulting in a loss of over RM700,000.</w:t>
+      </w:r>
+    </w:p>
+    <w:p>
+      <w:pPr>
+        <w:spacing w:after="0"/>
+      </w:pPr>
+    </w:p>
+    <w:p>
+      <w:pPr>
+        <w:spacing w:after="0"/>
+      </w:pPr>
+      <w:r>
+        <w:t>As digital communication becomes increasingly embedded in daily and professional activities, individuals are frequently exposed to potential cyber threats without adequate training or awareness. This highlights the need for more effective and engaging approaches to cybersecurity education.</w:t>
+      </w:r>
+    </w:p>
+    <w:p>
+      <w:pPr>
+        <w:spacing w:after="0"/>
+      </w:pPr>
+    </w:p>
+    <w:p>
+      <w:pPr>
+        <w:spacing w:after="0"/>
         <w:rPr>
-          <w:b/>
-          <w:bCs/>
+          <w:rStyle w:val="Heading1Char"/>
+          <w:rFonts w:eastAsiaTheme="minorHAnsi"/>
+          <w:color w:val="auto"/>
+          <w:sz w:val="24"/>
+          <w:szCs w:val="24"/>
+          <w:lang w:val="en-MY"/>
         </w:rPr>
       </w:pPr>
       <w:r>
+        <w:t>This project presents an interactive simulation game designed to raise awareness of common cyber threats. Players take on the role of an office employee managing emails, files, and daily tasks, where they must identify suspicious content and make decisions that influence the outcome. Through immersive gameplay</w:t>
+      </w:r>
+      <w:r>
+        <w:t xml:space="preserve">, </w:t>
+      </w:r>
+      <w:r>
+        <w:t>consequence-based mechanics,</w:t>
+      </w:r>
+      <w:r>
+        <w:t xml:space="preserve"> and a space to fail safely,</w:t>
+      </w:r>
+      <w:r>
+        <w:t xml:space="preserve"> the project aims to enhance users’ understanding of cybersecurity risks and encourage safer digital </w:t>
+      </w:r>
+      <w:proofErr w:type="spellStart"/>
+      <w:r>
+        <w:t>behaviour</w:t>
+      </w:r>
+      <w:proofErr w:type="spellEnd"/>
+      <w:r>
+        <w:t>.</w:t>
+      </w:r>
+      <w:r>
         <w:rPr>
-          <w:b/>
-          <w:bCs/>
+          <w:rStyle w:val="Heading1Char"/>
+          <w:lang w:val="en-MY"/>
+        </w:rPr>
+        <w:br w:type="page"/>
+      </w:r>
+    </w:p>
+    <w:p>
+      <w:pPr>
+        <w:rPr>
+          <w:rFonts w:eastAsiaTheme="majorEastAsia"/>
+          <w:color w:val="2F5496" w:themeColor="accent1" w:themeShade="BF"/>
+          <w:sz w:val="40"/>
+          <w:szCs w:val="40"/>
+        </w:rPr>
+      </w:pPr>
+      <w:r>
+        <w:rPr>
+          <w:rStyle w:val="Heading1Char"/>
+          <w:lang w:val="en-MY"/>
         </w:rPr>
         <w:lastRenderedPageBreak/>
-        <w:t>Introduction</w:t>
-      </w:r>
-    </w:p>
+        <w:t>2</w:t>
+      </w:r>
+      <w:r>
+        <w:rPr>
+          <w:rStyle w:val="Heading1Char"/>
+          <w:lang w:val="en-MY"/>
+        </w:rPr>
+        <w:t>.</w:t>
+      </w:r>
+      <w:r>
+        <w:rPr>
+          <w:rStyle w:val="Heading1Char"/>
+          <w:lang w:val="en-MY"/>
+        </w:rPr>
+        <w:t xml:space="preserve"> </w:t>
+      </w:r>
+      <w:r>
+        <w:rPr>
+          <w:rStyle w:val="Heading1Char"/>
+          <w:lang w:val="en-MY"/>
+        </w:rPr>
+        <w:t>Background</w:t>
+      </w:r>
+    </w:p>
+    <w:p>
+      <w:r>
+        <w:t>Personal data, particularly sensitive information, possesses significant value. Consequently, there is a rising frequency of reports regarding fraud victims whose financial accounts have been compromised through sophisticated social engineering tactics.</w:t>
+      </w:r>
+    </w:p>
+    <w:p>
+      <w:pPr>
+        <w:spacing w:after="0"/>
+      </w:pPr>
+    </w:p>
+    <w:p>
+      <w:r>
+        <w:t xml:space="preserve">Attempts to snatch </w:t>
+      </w:r>
+      <w:r>
+        <w:t>user</w:t>
+      </w:r>
+      <w:r>
+        <w:t xml:space="preserve"> private information are made </w:t>
+      </w:r>
+      <w:r>
+        <w:t>with various methods</w:t>
+      </w:r>
+      <w:r>
+        <w:t xml:space="preserve">, </w:t>
+      </w:r>
+      <w:r>
+        <w:t>with</w:t>
+      </w:r>
+      <w:r>
+        <w:t xml:space="preserve"> fraud attacks</w:t>
+      </w:r>
+      <w:r>
+        <w:t xml:space="preserve"> as the most common method</w:t>
+      </w:r>
+      <w:r>
+        <w:t>.</w:t>
+      </w:r>
+      <w:r>
+        <w:t xml:space="preserve"> </w:t>
+      </w:r>
+      <w:r>
+        <w:t>A</w:t>
+      </w:r>
+      <w:r>
+        <w:t xml:space="preserve">ccording to the Malaysia Computer Emergency Response Team (MyCERT), </w:t>
+      </w:r>
+      <w:r>
+        <w:t xml:space="preserve">the fraud attacks </w:t>
+      </w:r>
+      <w:r>
+        <w:t>involve</w:t>
+      </w:r>
+      <w:r>
+        <w:t xml:space="preserve"> spamming </w:t>
+      </w:r>
+      <w:r>
+        <w:t>the target’s</w:t>
+      </w:r>
+      <w:r>
+        <w:t xml:space="preserve"> inbox with phishing emails, enticing </w:t>
+      </w:r>
+      <w:r>
+        <w:t>users</w:t>
+      </w:r>
+      <w:r>
+        <w:t xml:space="preserve"> to download apps that harbor malicious code, or impersonating members of </w:t>
+      </w:r>
+      <w:r>
+        <w:t xml:space="preserve">family or authority </w:t>
+      </w:r>
+      <w:r>
+        <w:t xml:space="preserve">in an attempt to pressure </w:t>
+      </w:r>
+      <w:r>
+        <w:t>individuals</w:t>
+      </w:r>
+      <w:r>
+        <w:t xml:space="preserve"> into blindly following instructions.</w:t>
+      </w:r>
+    </w:p>
+    <w:p>
+      <w:pPr>
+        <w:spacing w:after="0"/>
+      </w:pPr>
+    </w:p>
+    <w:p>
+      <w:r>
+        <w:t xml:space="preserve">Current methods to raise cybersecurity awareness fell short in </w:t>
+      </w:r>
+      <w:r>
+        <w:t>certain aspects</w:t>
+      </w:r>
+      <w:r>
+        <w:t xml:space="preserve">. PowerPoint slides are packed with information, but too much text can quickly overwhelm or bore the reader. Although more in-depth, interactive training programs are available, they are usually costly, as their target audience are often large companies. </w:t>
+      </w:r>
+      <w:r>
+        <w:t>This</w:t>
+      </w:r>
+      <w:r>
+        <w:t xml:space="preserve"> project aims to provide cybersecurity awareness training that both keeps the user engaged and is also available for free online. The target users of this project </w:t>
+      </w:r>
+      <w:proofErr w:type="gramStart"/>
+      <w:r>
+        <w:t>is</w:t>
+      </w:r>
+      <w:proofErr w:type="gramEnd"/>
+      <w:r>
+        <w:t xml:space="preserve"> the general public.</w:t>
+      </w:r>
+    </w:p>
+    <w:p/>
     <w:p>
       <w:pPr>
         <w:pStyle w:val="Heading2"/>
       </w:pPr>
       <w:r>
-        <w:t>Background</w:t>
-      </w:r>
-    </w:p>
-    <w:p>
-      <w:pPr>
-        <w:jc w:val="both"/>
-      </w:pPr>
-      <w:r>
-        <w:t>Everyone has information, and some information, especially private information, is very valuable. Which is why we often come across news of fraud victims who had their bank accounts emptied through various traps.</w:t>
-      </w:r>
-    </w:p>
-    <w:p>
-      <w:pPr>
-        <w:spacing w:after="0"/>
-        <w:jc w:val="both"/>
-      </w:pPr>
-    </w:p>
-    <w:p>
-      <w:pPr>
-        <w:jc w:val="both"/>
-      </w:pPr>
-      <w:r>
-        <w:t>Attempts to snatch our private information are made in multiple ways, mainly fraud attacks, according to the Malaysia Computer Emergency Response Team (</w:t>
-      </w:r>
-      <w:proofErr w:type="spellStart"/>
-      <w:r>
-        <w:t>MyCERT</w:t>
-      </w:r>
-      <w:proofErr w:type="spellEnd"/>
-      <w:r>
-        <w:t>), by spamming our inbox with phishing emails, enticing us to download apps that harbor malicious code via third-party sites, or impersonating members of authority in an attempt to pressure us into blindly following instructions.</w:t>
-      </w:r>
-    </w:p>
-    <w:p>
-      <w:pPr>
-        <w:spacing w:after="0"/>
-        <w:jc w:val="both"/>
-      </w:pPr>
-    </w:p>
-    <w:p>
-      <w:pPr>
-        <w:jc w:val="both"/>
-      </w:pPr>
-      <w:r>
-        <w:t xml:space="preserve">Current methods to raise cybersecurity awareness fell short in some ways. PowerPoint slides are packed with information, but too much text can quickly overwhelm or bore the reader. Although more in-depth, interactive training programs are available, they are usually costly, as their target audience are often large companies. My project aims to provide cybersecurity awareness training that both keeps the user engaged and is also available for free online. The target users of this project </w:t>
-      </w:r>
-      <w:proofErr w:type="gramStart"/>
-      <w:r>
-        <w:t>is</w:t>
-      </w:r>
-      <w:proofErr w:type="gramEnd"/>
-      <w:r>
-        <w:t xml:space="preserve"> the general public.</w:t>
-      </w:r>
-    </w:p>
-    <w:p>
-      <w:pPr>
-        <w:jc w:val="both"/>
-      </w:pPr>
-    </w:p>
-    <w:p>
-      <w:pPr>
-        <w:pStyle w:val="Heading2"/>
-      </w:pPr>
+        <w:t>2.1</w:t>
+      </w:r>
+      <w:r>
+        <w:t xml:space="preserve">. </w:t>
+      </w:r>
       <w:r>
         <w:t>Objectives</w:t>
       </w:r>
@@ -584,6 +578,12 @@
         <w:pStyle w:val="Heading2"/>
       </w:pPr>
       <w:r>
+        <w:t>2.2</w:t>
+      </w:r>
+      <w:r>
+        <w:t xml:space="preserve">. </w:t>
+      </w:r>
+      <w:r>
         <w:t>Project Scope</w:t>
       </w:r>
     </w:p>
@@ -597,7 +597,25 @@
         <w:spacing w:after="0"/>
       </w:pPr>
       <w:r>
-        <w:t>To create a game that teaches how different cyberattacks work and how to avoid or deal with them.</w:t>
+        <w:t xml:space="preserve">To create a game that </w:t>
+      </w:r>
+      <w:r>
+        <w:t xml:space="preserve">spreads awareness of </w:t>
+      </w:r>
+      <w:r>
+        <w:t xml:space="preserve">the various </w:t>
+      </w:r>
+      <w:r>
+        <w:t>forms</w:t>
+      </w:r>
+      <w:r>
+        <w:t xml:space="preserve"> of </w:t>
+      </w:r>
+      <w:r>
+        <w:t>cyber-attacks</w:t>
+      </w:r>
+      <w:r>
+        <w:t xml:space="preserve"> and how to deal with them.</w:t>
       </w:r>
     </w:p>
     <w:p>
@@ -616,6 +634,1094 @@
       </w:pPr>
       <w:r>
         <w:t>To avoid scope creep, the game will only include the most common cybersecurity threats (phishing, social engineering, ransomware).</w:t>
+      </w:r>
+      <w:r>
+        <w:br w:type="page"/>
+      </w:r>
+    </w:p>
+    <w:p>
+      <w:pPr>
+        <w:pStyle w:val="Heading1"/>
+      </w:pPr>
+      <w:r>
+        <w:lastRenderedPageBreak/>
+        <w:t>3</w:t>
+      </w:r>
+      <w:r>
+        <w:t xml:space="preserve">. </w:t>
+      </w:r>
+      <w:r>
+        <w:t>Similar Works</w:t>
+      </w:r>
+    </w:p>
+    <w:p>
+      <w:pPr>
+        <w:pStyle w:val="ListParagraph"/>
+        <w:numPr>
+          <w:ilvl w:val="0"/>
+          <w:numId w:val="5"/>
+        </w:numPr>
+      </w:pPr>
+      <w:hyperlink r:id="rId6" w:history="1">
+        <w:r>
+          <w:rPr>
+            <w:rStyle w:val="Hyperlink"/>
+          </w:rPr>
+          <w:t>Phishing Quiz</w:t>
+        </w:r>
+        <w:r>
+          <w:rPr>
+            <w:rStyle w:val="Hyperlink"/>
+          </w:rPr>
+          <w:t xml:space="preserve">: </w:t>
+        </w:r>
+        <w:r>
+          <w:rPr>
+            <w:rStyle w:val="Hyperlink"/>
+          </w:rPr>
+          <w:t>Jigsaw - Google</w:t>
+        </w:r>
+      </w:hyperlink>
+    </w:p>
+    <w:p>
+      <w:pPr>
+        <w:pStyle w:val="ListParagraph"/>
+        <w:numPr>
+          <w:ilvl w:val="1"/>
+          <w:numId w:val="5"/>
+        </w:numPr>
+      </w:pPr>
+      <w:r>
+        <w:t>Google’s Phishing Quiz, developed by Jigsaw</w:t>
+      </w:r>
+      <w:r>
+        <w:t>.</w:t>
+      </w:r>
+    </w:p>
+    <w:p>
+      <w:pPr>
+        <w:pStyle w:val="ListParagraph"/>
+      </w:pPr>
+    </w:p>
+    <w:p>
+      <w:pPr>
+        <w:pStyle w:val="ListParagraph"/>
+      </w:pPr>
+    </w:p>
+    <w:p>
+      <w:pPr>
+        <w:pStyle w:val="ListParagraph"/>
+      </w:pPr>
+    </w:p>
+    <w:p>
+      <w:pPr>
+        <w:pStyle w:val="ListParagraph"/>
+        <w:numPr>
+          <w:ilvl w:val="0"/>
+          <w:numId w:val="4"/>
+        </w:numPr>
+      </w:pPr>
+      <w:hyperlink r:id="rId7" w:history="1">
+        <w:proofErr w:type="spellStart"/>
+        <w:r>
+          <w:rPr>
+            <w:rStyle w:val="Hyperlink"/>
+          </w:rPr>
+          <w:t>PhishingBox</w:t>
+        </w:r>
+        <w:proofErr w:type="spellEnd"/>
+      </w:hyperlink>
+    </w:p>
+    <w:p>
+      <w:pPr>
+        <w:pStyle w:val="ListParagraph"/>
+        <w:numPr>
+          <w:ilvl w:val="1"/>
+          <w:numId w:val="4"/>
+        </w:numPr>
+      </w:pPr>
+      <w:proofErr w:type="spellStart"/>
+      <w:r>
+        <w:t>PhishingBox</w:t>
+      </w:r>
+      <w:proofErr w:type="spellEnd"/>
+      <w:r>
+        <w:t xml:space="preserve"> </w:t>
+      </w:r>
+      <w:r>
+        <w:t xml:space="preserve">is </w:t>
+      </w:r>
+      <w:r>
+        <w:t>one of the main inspirations for this project’s conception and development.</w:t>
+      </w:r>
+      <w:r>
+        <w:t xml:space="preserve"> On its website it has a free version and a paid version. The free version is composed of ten </w:t>
+      </w:r>
+      <w:r>
+        <w:t xml:space="preserve">scenarios in which the </w:t>
+      </w:r>
+      <w:r>
+        <w:t xml:space="preserve">player has to </w:t>
+      </w:r>
+      <w:r>
+        <w:t>determine legitimate or phishing.</w:t>
+      </w:r>
+      <w:r>
+        <w:t xml:space="preserve"> It has a </w:t>
+      </w:r>
+      <w:r>
+        <w:t xml:space="preserve">paid version where the </w:t>
+      </w:r>
+      <w:r>
+        <w:t xml:space="preserve">company can author its own scenarios. The paid version’s target audience are companies and enterprises </w:t>
+      </w:r>
+      <w:r>
+        <w:t>so the price for it is significantly higher.</w:t>
+      </w:r>
+      <w:r>
+        <w:t> </w:t>
+      </w:r>
+    </w:p>
+    <w:p>
+      <w:pPr>
+        <w:pStyle w:val="ListParagraph"/>
+      </w:pPr>
+    </w:p>
+    <w:p>
+      <w:pPr>
+        <w:pStyle w:val="ListParagraph"/>
+      </w:pPr>
+    </w:p>
+    <w:p>
+      <w:pPr>
+        <w:pStyle w:val="ListParagraph"/>
+      </w:pPr>
+    </w:p>
+    <w:p>
+      <w:pPr>
+        <w:pStyle w:val="ListParagraph"/>
+        <w:numPr>
+          <w:ilvl w:val="0"/>
+          <w:numId w:val="4"/>
+        </w:numPr>
+      </w:pPr>
+      <w:hyperlink r:id="rId8" w:history="1">
+        <w:r>
+          <w:rPr>
+            <w:rStyle w:val="Hyperlink"/>
+          </w:rPr>
+          <w:t>HackTale3D</w:t>
+        </w:r>
+      </w:hyperlink>
+    </w:p>
+    <w:p>
+      <w:pPr>
+        <w:pStyle w:val="ListParagraph"/>
+        <w:numPr>
+          <w:ilvl w:val="1"/>
+          <w:numId w:val="4"/>
+        </w:numPr>
+      </w:pPr>
+      <w:r>
+        <w:t xml:space="preserve">HackTale3D </w:t>
+      </w:r>
+      <w:r>
+        <w:t>is a game about cybersecurity</w:t>
+      </w:r>
+      <w:r>
+        <w:t xml:space="preserve">. It </w:t>
+      </w:r>
+      <w:r>
+        <w:t xml:space="preserve">has engaging storytelling </w:t>
+      </w:r>
+      <w:r>
+        <w:t xml:space="preserve">in the form of </w:t>
+      </w:r>
+      <w:r>
+        <w:t>3D</w:t>
+      </w:r>
+      <w:r>
+        <w:t xml:space="preserve"> animations </w:t>
+      </w:r>
+      <w:r>
+        <w:t xml:space="preserve">and </w:t>
+      </w:r>
+      <w:r>
+        <w:t>character dialogues.</w:t>
+      </w:r>
+      <w:r>
+        <w:t xml:space="preserve"> </w:t>
+      </w:r>
+      <w:r>
+        <w:t>Its</w:t>
+      </w:r>
+      <w:r>
+        <w:t xml:space="preserve"> </w:t>
+      </w:r>
+      <w:r>
+        <w:t>gameplay</w:t>
+      </w:r>
+      <w:r>
+        <w:t xml:space="preserve"> is also interactive where players can observe </w:t>
+      </w:r>
+      <w:r>
+        <w:t xml:space="preserve">elements of the environment to find clues and determine </w:t>
+      </w:r>
+      <w:r>
+        <w:t>entries of attacks</w:t>
+      </w:r>
+      <w:r>
+        <w:t>. Hacktale3D</w:t>
+      </w:r>
+      <w:r>
+        <w:t xml:space="preserve"> is the most interactive out of </w:t>
+      </w:r>
+      <w:r>
+        <w:t xml:space="preserve">the works mentioned </w:t>
+      </w:r>
+      <w:r>
+        <w:t>i</w:t>
+      </w:r>
+      <w:r>
+        <w:t xml:space="preserve">n this list </w:t>
+      </w:r>
+      <w:r>
+        <w:t>but the level of knowledge the user learns is far too in-depth for the general public.</w:t>
+      </w:r>
+    </w:p>
+    <w:p>
+      <w:pPr>
+        <w:pStyle w:val="ListParagraph"/>
+      </w:pPr>
+    </w:p>
+    <w:p/>
+    <w:p>
+      <w:r>
+        <w:br w:type="page"/>
+      </w:r>
+    </w:p>
+    <w:p>
+      <w:pPr>
+        <w:pStyle w:val="Heading1"/>
+      </w:pPr>
+      <w:r>
+        <w:lastRenderedPageBreak/>
+        <w:t>4</w:t>
+      </w:r>
+      <w:r>
+        <w:t>. Methodologies</w:t>
+      </w:r>
+    </w:p>
+    <w:p>
+      <w:pPr>
+        <w:pStyle w:val="Heading2"/>
+      </w:pPr>
+      <w:r>
+        <w:t>4</w:t>
+      </w:r>
+      <w:r>
+        <w:t>.1. Project Approach</w:t>
+      </w:r>
+    </w:p>
+    <w:p>
+      <w:r>
+        <w:t>The project utilized a Kanban-based Agile methodology to manage the inherent uncertainty of game development. Due to the initial technical learning curve, the project backlog remained highly dynamic. This allowed for continuous refinement of tasks based on newly discovered technical constraints and playtesting feedback, ensuring that resources were always focused on high-value, feasible features rather than a fixed, outdated plan.</w:t>
+      </w:r>
+      <w:r>
+        <w:t xml:space="preserve"> </w:t>
+      </w:r>
+      <w:r>
+        <w:rPr>
+          <w:highlight w:val="yellow"/>
+        </w:rPr>
+        <w:t xml:space="preserve">The time interval set for each sprint </w:t>
+      </w:r>
+      <w:r>
+        <w:rPr>
+          <w:highlight w:val="yellow"/>
+        </w:rPr>
+        <w:t>is two weeks.</w:t>
+      </w:r>
+      <w:r>
+        <w:rPr>
+          <w:highlight w:val="yellow"/>
+        </w:rPr>
+        <w:t xml:space="preserve"> Talk more about sprints.</w:t>
+      </w:r>
+    </w:p>
+    <w:p/>
+    <w:p>
+      <w:pPr>
+        <w:pStyle w:val="Heading2"/>
+      </w:pPr>
+      <w:r>
+        <w:t>4</w:t>
+      </w:r>
+      <w:r>
+        <w:t xml:space="preserve">.2. </w:t>
+      </w:r>
+      <w:r>
+        <w:t>Tools and Technologies Used</w:t>
+      </w:r>
+    </w:p>
+    <w:p>
+      <w:pPr>
+        <w:pStyle w:val="Heading3"/>
+      </w:pPr>
+      <w:r>
+        <w:t>4</w:t>
+      </w:r>
+      <w:r>
+        <w:t>.2.1 Godot</w:t>
+      </w:r>
+    </w:p>
+    <w:p>
+      <w:r>
+        <w:t>The game component of this project was developed using the Godot Engine (Version 4.3). Godot was selected primarily for its minimal learning curve and its highly integrated Control Node system, which facilitates the creation of complex, responsive user interfaces. Furthermore, Godot’s lightweight architecture offers a significant advantage in terms of resource efficiency and rapid iteration speeds compared to more resource-intensive engines like Unity or Unreal. While Godot may lack the extensive library of high-fidelity pre-built assets and monolithic features found in larger commercial engines, its existing feature set is fully sufficient for the defined scope of this project, ensuring a streamlined development process without unnecessary software overhead.</w:t>
+      </w:r>
+    </w:p>
+    <w:p/>
+    <w:p>
+      <w:pPr>
+        <w:pStyle w:val="Heading3"/>
+      </w:pPr>
+      <w:r>
+        <w:t>4</w:t>
+      </w:r>
+      <w:r>
+        <w:t>.2.2 Paint.NET</w:t>
+      </w:r>
+    </w:p>
+    <w:p>
+      <w:r>
+        <w:t>Paint.NET is used to create</w:t>
+      </w:r>
+      <w:r>
+        <w:t xml:space="preserve"> or modify</w:t>
+      </w:r>
+      <w:r>
+        <w:t xml:space="preserve"> image assets to be</w:t>
+      </w:r>
+      <w:r>
+        <w:t xml:space="preserve"> imported and</w:t>
+      </w:r>
+      <w:r>
+        <w:t xml:space="preserve"> used in Godot.</w:t>
+      </w:r>
+    </w:p>
+    <w:p/>
+    <w:p>
+      <w:pPr>
+        <w:pStyle w:val="Heading3"/>
+      </w:pPr>
+      <w:r>
+        <w:t>4</w:t>
+      </w:r>
+      <w:r>
+        <w:t>.2.3 MongoDB Atlas</w:t>
+      </w:r>
+    </w:p>
+    <w:p>
+      <w:r>
+        <w:t xml:space="preserve">A free version of </w:t>
+      </w:r>
+      <w:r>
+        <w:t xml:space="preserve">MongoDB Atlas </w:t>
+      </w:r>
+      <w:r>
+        <w:t xml:space="preserve">is used to create </w:t>
+      </w:r>
+      <w:r>
+        <w:t>a</w:t>
+      </w:r>
+      <w:r>
+        <w:t xml:space="preserve"> </w:t>
+      </w:r>
+      <w:r>
+        <w:t>cloud</w:t>
+      </w:r>
+      <w:r>
+        <w:t xml:space="preserve"> database to store </w:t>
+      </w:r>
+      <w:r>
+        <w:t>player scores.</w:t>
+      </w:r>
+      <w:r>
+        <w:t xml:space="preserve"> A Cloud database is crucial as the server will always be online and not require </w:t>
+      </w:r>
+      <w:r>
+        <w:t>servers to be hosted on the developer’s device.</w:t>
+      </w:r>
+    </w:p>
+    <w:p/>
+    <w:p>
+      <w:pPr>
+        <w:pStyle w:val="Heading3"/>
+      </w:pPr>
+      <w:r>
+        <w:t>4</w:t>
+      </w:r>
+      <w:r>
+        <w:t>.2.4 node.js</w:t>
+      </w:r>
+    </w:p>
+    <w:p>
+      <w:r>
+        <w:t xml:space="preserve">A node.js server exposes the API endpoints for </w:t>
+      </w:r>
+      <w:r>
+        <w:t>the Godot game to send and receive player scores</w:t>
+      </w:r>
+      <w:r>
+        <w:t xml:space="preserve"> </w:t>
+      </w:r>
+      <w:r>
+        <w:t xml:space="preserve">from the MongoDB Atlas </w:t>
+      </w:r>
+      <w:r>
+        <w:t xml:space="preserve">cloud </w:t>
+      </w:r>
+      <w:r>
+        <w:t>database.</w:t>
+      </w:r>
+    </w:p>
+    <w:p>
+      <w:r>
+        <w:br w:type="page"/>
+      </w:r>
+    </w:p>
+    <w:p>
+      <w:pPr>
+        <w:pStyle w:val="Heading1"/>
+      </w:pPr>
+      <w:r>
+        <w:lastRenderedPageBreak/>
+        <w:t>5. Legal, Social, Ethical and Professional</w:t>
+      </w:r>
+      <w:r>
+        <w:t xml:space="preserve"> Issues</w:t>
+      </w:r>
+    </w:p>
+    <w:p>
+      <w:r>
+        <w:t>P</w:t>
+      </w:r>
+      <w:r>
+        <w:t>laceholder</w:t>
+      </w:r>
+      <w:r>
+        <w:t>, license for image</w:t>
+      </w:r>
+      <w:r>
+        <w:br w:type="page"/>
+      </w:r>
+    </w:p>
+    <w:p>
+      <w:pPr>
+        <w:pStyle w:val="Heading1"/>
+      </w:pPr>
+      <w:r>
+        <w:lastRenderedPageBreak/>
+        <w:t>6</w:t>
+      </w:r>
+      <w:r>
+        <w:t>. Project Management</w:t>
+      </w:r>
+    </w:p>
+    <w:p/>
+    <w:p>
+      <w:pPr>
+        <w:pStyle w:val="Heading2"/>
+      </w:pPr>
+      <w:r>
+        <w:t>6</w:t>
+      </w:r>
+      <w:r>
+        <w:t>.</w:t>
+      </w:r>
+      <w:r>
+        <w:t>1</w:t>
+      </w:r>
+      <w:r>
+        <w:t xml:space="preserve"> </w:t>
+      </w:r>
+      <w:r>
+        <w:t>GitHub</w:t>
+      </w:r>
+    </w:p>
+    <w:p>
+      <w:r>
+        <w:t xml:space="preserve">GitHub </w:t>
+      </w:r>
+      <w:r>
+        <w:t xml:space="preserve">and GitHub Desktop </w:t>
+      </w:r>
+      <w:r>
+        <w:t>is used for version control.</w:t>
+      </w:r>
+      <w:r>
+        <w:t xml:space="preserve"> </w:t>
+      </w:r>
+    </w:p>
+    <w:p/>
+    <w:p>
+      <w:pPr>
+        <w:pStyle w:val="Heading2"/>
+      </w:pPr>
+      <w:r>
+        <w:t>6.</w:t>
+      </w:r>
+      <w:r>
+        <w:t xml:space="preserve">2 </w:t>
+      </w:r>
+      <w:r>
+        <w:t>Demonstration</w:t>
+      </w:r>
+    </w:p>
+    <w:p>
+      <w:r>
+        <w:t xml:space="preserve">The project’s progress is then demonstrated for the </w:t>
+      </w:r>
+      <w:r>
+        <w:t xml:space="preserve">users, </w:t>
+      </w:r>
+      <w:r>
+        <w:t>lecturer and supervisor</w:t>
+      </w:r>
+      <w:r>
+        <w:t xml:space="preserve"> </w:t>
+      </w:r>
+      <w:r>
+        <w:t>involved</w:t>
+      </w:r>
+      <w:r>
+        <w:t xml:space="preserve"> for feedback</w:t>
+      </w:r>
+      <w:r>
+        <w:t xml:space="preserve">. </w:t>
+      </w:r>
+    </w:p>
+    <w:p>
+      <w:r>
+        <w:br w:type="page"/>
+      </w:r>
+    </w:p>
+    <w:p>
+      <w:pPr>
+        <w:pStyle w:val="Heading1"/>
+      </w:pPr>
+      <w:r>
+        <w:lastRenderedPageBreak/>
+        <w:t>7</w:t>
+      </w:r>
+      <w:r>
+        <w:t>. Final System Architecture</w:t>
+      </w:r>
+    </w:p>
+    <w:p>
+      <w:r>
+        <w:t xml:space="preserve">The diagram below </w:t>
+      </w:r>
+      <w:r>
+        <w:t>shows</w:t>
+      </w:r>
+      <w:r>
+        <w:t xml:space="preserve"> the game’s high-level system architecture. Players interact with the game through UI objects (scene instances) that emit signals upon input. These signals are </w:t>
+      </w:r>
+      <w:r>
+        <w:t>received</w:t>
+      </w:r>
+      <w:r>
+        <w:t xml:space="preserve"> by the game’s services, implemented as Autoloads. These Autoloads ensure data persistence across different scenes</w:t>
+      </w:r>
+      <w:r>
+        <w:t xml:space="preserve">, which is </w:t>
+      </w:r>
+      <w:r>
+        <w:t xml:space="preserve">a </w:t>
+      </w:r>
+      <w:r>
+        <w:t>vital feature</w:t>
+      </w:r>
+      <w:r>
+        <w:t xml:space="preserve"> since Godot’s standard scene system does not inherently retain state when switching between </w:t>
+      </w:r>
+      <w:r>
+        <w:t>scenes</w:t>
+      </w:r>
+      <w:r>
+        <w:t xml:space="preserve"> (Godot n.d.).</w:t>
+      </w:r>
+      <w:r>
+        <w:t xml:space="preserve"> After processing</w:t>
+      </w:r>
+      <w:r>
+        <w:t xml:space="preserve">, the Autoloads involved emits a signal along with </w:t>
+      </w:r>
+      <w:r>
+        <w:t>data (if needed)</w:t>
+      </w:r>
+      <w:r>
+        <w:t xml:space="preserve">. The signals are then </w:t>
+      </w:r>
+      <w:r>
+        <w:t xml:space="preserve">received by the scene instances, which in turn </w:t>
+      </w:r>
+      <w:r>
+        <w:t>had their displays updated.</w:t>
+      </w:r>
+    </w:p>
+    <w:p>
+      <w:hyperlink r:id="rId9" w:history="1">
+        <w:r>
+          <w:rPr>
+            <w:rStyle w:val="Hyperlink"/>
+          </w:rPr>
+          <w:t>https://docs.godotengine.org/en/latest/tutorials/scripting/singletons_autoload.html</w:t>
+        </w:r>
+      </w:hyperlink>
+      <w:r>
+        <w:t xml:space="preserve"> </w:t>
+      </w:r>
+    </w:p>
+    <w:p/>
+    <w:p>
+      <w:pPr>
+        <w:jc w:val="center"/>
+      </w:pPr>
+      <w:r>
+        <w:rPr>
+          <w:noProof/>
+        </w:rPr>
+        <w:drawing>
+          <wp:inline distT="0" distB="0" distL="0" distR="0" wp14:anchorId="21FD2866" wp14:editId="6DCF36B9">
+            <wp:extent cx="4006048" cy="1606418"/>
+            <wp:effectExtent l="0" t="0" r="0" b="0"/>
+            <wp:docPr id="2037583176" name="Picture 1"/>
+            <wp:cNvGraphicFramePr>
+              <a:graphicFrameLocks xmlns:a="http://schemas.openxmlformats.org/drawingml/2006/main" noChangeAspect="1"/>
+            </wp:cNvGraphicFramePr>
+            <a:graphic xmlns:a="http://schemas.openxmlformats.org/drawingml/2006/main">
+              <a:graphicData uri="http://schemas.openxmlformats.org/drawingml/2006/picture">
+                <pic:pic xmlns:pic="http://schemas.openxmlformats.org/drawingml/2006/picture">
+                  <pic:nvPicPr>
+                    <pic:cNvPr id="2037583176" name="Picture 1"/>
+                    <pic:cNvPicPr/>
+                  </pic:nvPicPr>
+                  <pic:blipFill>
+                    <a:blip r:embed="rId10">
+                      <a:extLst>
+                        <a:ext uri="{28A0092B-C50C-407E-A947-70E740481C1C}">
+                          <a14:useLocalDpi xmlns:a14="http://schemas.microsoft.com/office/drawing/2010/main" val="0"/>
+                        </a:ext>
+                      </a:extLst>
+                    </a:blip>
+                    <a:stretch>
+                      <a:fillRect/>
+                    </a:stretch>
+                  </pic:blipFill>
+                  <pic:spPr>
+                    <a:xfrm>
+                      <a:off x="0" y="0"/>
+                      <a:ext cx="4006048" cy="1606418"/>
+                    </a:xfrm>
+                    <a:prstGeom prst="rect">
+                      <a:avLst/>
+                    </a:prstGeom>
+                  </pic:spPr>
+                </pic:pic>
+              </a:graphicData>
+            </a:graphic>
+          </wp:inline>
+        </w:drawing>
+      </w:r>
+    </w:p>
+    <w:p>
+      <w:pPr>
+        <w:jc w:val="center"/>
+      </w:pPr>
+    </w:p>
+    <w:p>
+      <w:pPr>
+        <w:pStyle w:val="Heading2"/>
+      </w:pPr>
+      <w:r>
+        <w:t>7</w:t>
+      </w:r>
+      <w:r>
+        <w:t xml:space="preserve">.1 </w:t>
+      </w:r>
+      <w:r>
+        <w:t xml:space="preserve">Godot </w:t>
+      </w:r>
+      <w:r>
+        <w:t>Game</w:t>
+      </w:r>
+    </w:p>
+    <w:p>
+      <w:r>
+        <w:t xml:space="preserve">The game is a </w:t>
+      </w:r>
+      <w:r>
+        <w:rPr>
+          <w:b/>
+          <w:bCs/>
+        </w:rPr>
+        <w:t>point-and-click digital simulation</w:t>
+      </w:r>
+      <w:r>
+        <w:t xml:space="preserve"> where the player assumes the role of an employee at a stationery manufacturing company. Tasked with managing inbound logistics, the player must process purchase orders via a virtual email interface. The core narrative tension arises from cybersecurity threats; players must meticulously inspect email elements for signs of phishing before interacting with any attachments. Once verified as legitimate, files are processed and </w:t>
+      </w:r>
+      <w:r>
+        <w:t>sent</w:t>
+      </w:r>
+      <w:r>
+        <w:t xml:space="preserve"> to </w:t>
+      </w:r>
+      <w:r>
+        <w:t>the designated recipient</w:t>
+      </w:r>
+      <w:r>
+        <w:t xml:space="preserve">. This loop is structured over five in-game days (levels), with each day increasing in </w:t>
+      </w:r>
+      <w:r>
+        <w:t>difficulty</w:t>
+      </w:r>
+      <w:r>
+        <w:t>.</w:t>
+      </w:r>
+    </w:p>
+    <w:p/>
+    <w:p>
+      <w:pPr>
+        <w:pStyle w:val="Heading3"/>
+      </w:pPr>
+      <w:r>
+        <w:t>7</w:t>
+      </w:r>
+      <w:r>
+        <w:t xml:space="preserve">.1.1 </w:t>
+      </w:r>
+      <w:r>
+        <w:t>Core Scenes and Functions</w:t>
+      </w:r>
+    </w:p>
+    <w:p/>
+    <w:p/>
+    <w:p>
+      <w:pPr>
+        <w:pStyle w:val="Heading3"/>
+      </w:pPr>
+      <w:r>
+        <w:t>7</w:t>
+      </w:r>
+      <w:r>
+        <w:t>.1.2 Managers and Services (Autoload)</w:t>
+      </w:r>
+    </w:p>
+    <w:p/>
+    <w:p/>
+    <w:p>
+      <w:pPr>
+        <w:pStyle w:val="Heading2"/>
+      </w:pPr>
+      <w:r>
+        <w:lastRenderedPageBreak/>
+        <w:t>7</w:t>
+      </w:r>
+      <w:r>
+        <w:t xml:space="preserve">.2 </w:t>
+      </w:r>
+      <w:r>
+        <w:t xml:space="preserve">node.js </w:t>
+      </w:r>
+      <w:r>
+        <w:t>Server</w:t>
+      </w:r>
+    </w:p>
+    <w:p>
+      <w:r>
+        <w:br w:type="page"/>
+      </w:r>
+    </w:p>
+    <w:p>
+      <w:pPr>
+        <w:pStyle w:val="Heading1"/>
+      </w:pPr>
+      <w:r>
+        <w:lastRenderedPageBreak/>
+        <w:t>8</w:t>
+      </w:r>
+      <w:r>
+        <w:t>. Development</w:t>
+      </w:r>
+      <w:r>
+        <w:t xml:space="preserve"> Stages</w:t>
+      </w:r>
+    </w:p>
+    <w:p>
+      <w:pPr>
+        <w:pStyle w:val="Heading2"/>
+      </w:pPr>
+      <w:r>
+        <w:t>8</w:t>
+      </w:r>
+      <w:r>
+        <w:t>.1</w:t>
+      </w:r>
+      <w:r>
+        <w:t>. Sprint 1: Idea Generation and Sketching</w:t>
+      </w:r>
+    </w:p>
+    <w:p>
+      <w:r>
+        <w:t>In the first sprint, the system’s rough architecture and requirements are generated and sketched</w:t>
+      </w:r>
+      <w:r>
+        <w:br w:type="page"/>
+      </w:r>
+    </w:p>
+    <w:p>
+      <w:pPr>
+        <w:pStyle w:val="Heading1"/>
+      </w:pPr>
+      <w:r>
+        <w:lastRenderedPageBreak/>
+        <w:t>9</w:t>
+      </w:r>
+      <w:r>
+        <w:t xml:space="preserve">. </w:t>
+      </w:r>
+      <w:r>
+        <w:t>End-Project</w:t>
+      </w:r>
+      <w:r>
+        <w:t xml:space="preserve"> Report</w:t>
+      </w:r>
+    </w:p>
+    <w:p>
+      <w:r>
+        <w:t>Brief summary</w:t>
+      </w:r>
+    </w:p>
+    <w:p>
+      <w:r>
+        <w:t>Produced for a client</w:t>
+      </w:r>
+    </w:p>
+    <w:p>
+      <w:r>
+        <w:t>Project objectives and were they met</w:t>
+      </w:r>
+    </w:p>
+    <w:p>
+      <w:r>
+        <w:t>Realistic criticisms</w:t>
+      </w:r>
+    </w:p>
+    <w:p>
+      <w:r>
+        <w:t>Changes made</w:t>
+      </w:r>
+    </w:p>
+    <w:p>
+      <w:pPr>
+        <w:pStyle w:val="Heading1"/>
+      </w:pPr>
+      <w:r>
+        <w:t>10</w:t>
+      </w:r>
+      <w:r>
+        <w:t xml:space="preserve">. </w:t>
+      </w:r>
+      <w:r>
+        <w:t xml:space="preserve">Project </w:t>
+      </w:r>
+      <w:r>
+        <w:t>Reflections</w:t>
+      </w:r>
+    </w:p>
+    <w:p>
+      <w:pPr>
+        <w:pStyle w:val="Heading2"/>
+      </w:pPr>
+      <w:r>
+        <w:t>10.1 What went well</w:t>
+      </w:r>
+    </w:p>
+    <w:p>
+      <w:pPr>
+        <w:pStyle w:val="Heading2"/>
+      </w:pPr>
+      <w:r>
+        <w:t>10.1 What went badly</w:t>
+      </w:r>
+    </w:p>
+    <w:p>
+      <w:r>
+        <w:t>Underestimation of time needed.</w:t>
+      </w:r>
+      <w:r>
+        <w:t xml:space="preserve"> Did not adhere to Gantt Chart.</w:t>
+      </w:r>
+      <w:r>
+        <w:t xml:space="preserve"> Not enough time for visual customization (colour select) and also </w:t>
+      </w:r>
+      <w:r>
+        <w:t>no music is added due to time constraints.</w:t>
+      </w:r>
+    </w:p>
+    <w:p/>
+    <w:p>
+      <w:pPr>
+        <w:pStyle w:val="Heading1"/>
+      </w:pPr>
+      <w:r>
+        <w:t>11</w:t>
+      </w:r>
+      <w:r>
+        <w:t>. Conclusion</w:t>
+      </w:r>
+      <w:r>
+        <w:t>s</w:t>
+      </w:r>
+    </w:p>
+    <w:p>
+      <w:pPr>
+        <w:rPr>
+          <w:rFonts w:eastAsiaTheme="majorEastAsia"/>
+          <w:color w:val="2F5496" w:themeColor="accent1" w:themeShade="BF"/>
+          <w:sz w:val="40"/>
+          <w:szCs w:val="40"/>
+        </w:rPr>
+      </w:pPr>
+      <w:r>
+        <w:br w:type="page"/>
+      </w:r>
+    </w:p>
+    <w:p>
+      <w:pPr>
+        <w:pStyle w:val="Heading1"/>
+      </w:pPr>
+      <w:r>
+        <w:lastRenderedPageBreak/>
+        <w:t>1</w:t>
+      </w:r>
+      <w:r>
+        <w:t>2</w:t>
+      </w:r>
+      <w:r>
+        <w:t>. References</w:t>
+      </w:r>
+    </w:p>
+    <w:p>
+      <w:hyperlink r:id="rId11" w:history="1">
+        <w:r>
+          <w:rPr>
+            <w:rStyle w:val="Hyperlink"/>
+          </w:rPr>
+          <w:t>https://www.malaymail.com/news/malaysia/2026/01/22/home-ministry-malaysias-online-fraud-surge-drains-rm277b-in-2025-the-highest-in-three-years/206298</w:t>
+        </w:r>
+      </w:hyperlink>
+      <w:r>
+        <w:t xml:space="preserve"> </w:t>
+      </w:r>
+    </w:p>
+    <w:p/>
+    <w:p>
+      <w:hyperlink r:id="rId12" w:history="1">
+        <w:r>
+          <w:rPr>
+            <w:rStyle w:val="Hyperlink"/>
+          </w:rPr>
+          <w:t>https://www.nst.com.my/news/regional/2026/03/1399411/spoofed-email-scam-sees-accountant-transfer-over-rm700k-fake-supplier?source=widget</w:t>
+        </w:r>
+      </w:hyperlink>
+    </w:p>
+    <w:p/>
+    <w:p>
+      <w:r>
+        <w:t xml:space="preserve">Malaysia Computer Emergency Response Team. (2025). MyCERT: Incident Statistics - Reported Incidents based on General Incident Classification Statistics 2025 [online]. Available from: </w:t>
+      </w:r>
+      <w:hyperlink r:id="rId13" w:history="1">
+        <w:r>
+          <w:rPr>
+            <w:rStyle w:val="Hyperlink"/>
+          </w:rPr>
+          <w:t>https://www.mycert.org.my/portal/statistics-content?menu=b75e037d-6ee3-4d11-8169-66677d694932&amp;id=23495156-c6ec-48fa-89e2-c73bc081e157</w:t>
+        </w:r>
+      </w:hyperlink>
+      <w:r>
+        <w:t xml:space="preserve"> [accessed 30 September 2025]</w:t>
+      </w:r>
+    </w:p>
+    <w:p/>
+    <w:p>
+      <w:proofErr w:type="spellStart"/>
+      <w:r>
+        <w:t>PhishingBox</w:t>
+      </w:r>
+      <w:proofErr w:type="spellEnd"/>
+      <w:r>
+        <w:t xml:space="preserve">. (n.d.). Free Phishing Email IQ Test by </w:t>
+      </w:r>
+      <w:proofErr w:type="spellStart"/>
+      <w:r>
+        <w:t>PhishingBox</w:t>
+      </w:r>
+      <w:proofErr w:type="spellEnd"/>
+      <w:r>
+        <w:t xml:space="preserve"> [online]. Available from: </w:t>
+      </w:r>
+      <w:hyperlink r:id="rId14" w:history="1">
+        <w:r>
+          <w:rPr>
+            <w:rStyle w:val="Hyperlink"/>
+          </w:rPr>
+          <w:t>https://www.phishingbox.com/phishing-test</w:t>
+        </w:r>
+      </w:hyperlink>
+      <w:r>
+        <w:t xml:space="preserve"> [accessed 29 September 2025]</w:t>
+      </w:r>
+    </w:p>
+    <w:p/>
+    <w:p>
+      <w:r>
+        <w:t xml:space="preserve">Federal Trade Commission. (n.d.). Phishing Quiz | Federal Trade Commission [online]. Available from: </w:t>
+      </w:r>
+      <w:hyperlink r:id="rId15" w:history="1">
+        <w:r>
+          <w:rPr>
+            <w:rStyle w:val="Hyperlink"/>
+          </w:rPr>
+          <w:t>https://www.phishingbox.com/phishing-test</w:t>
+        </w:r>
+      </w:hyperlink>
+      <w:r>
+        <w:t xml:space="preserve"> [accessed 29 September 2025]</w:t>
+      </w:r>
+    </w:p>
+    <w:p/>
+    <w:p>
+      <w:proofErr w:type="spellStart"/>
+      <w:r>
+        <w:t>HackTale</w:t>
+      </w:r>
+      <w:proofErr w:type="spellEnd"/>
+      <w:r>
+        <w:t xml:space="preserve">. (n.d.). HackTale3D [online]. Available from: </w:t>
+      </w:r>
+      <w:hyperlink r:id="rId16" w:history="1">
+        <w:r>
+          <w:rPr>
+            <w:rStyle w:val="Hyperlink"/>
+          </w:rPr>
+          <w:t>https://hacktale.s3.eu-west-1.amazonaws.com/index.html</w:t>
+        </w:r>
+      </w:hyperlink>
+      <w:r>
+        <w:t xml:space="preserve"> [accessed 29 September 2025]</w:t>
       </w:r>
     </w:p>
     <w:sectPr>
@@ -717,6 +1823,119 @@
     </w:lvl>
   </w:abstractNum>
   <w:abstractNum w:abstractNumId="1" w15:restartNumberingAfterBreak="0">
+    <w:nsid w:val="238E4101"/>
+    <w:multiLevelType w:val="hybridMultilevel"/>
+    <w:tmpl w:val="E9AC0CDA"/>
+    <w:lvl w:ilvl="0" w:tplc="44090001">
+      <w:start w:val="1"/>
+      <w:numFmt w:val="bullet"/>
+      <w:lvlText w:val=""/>
+      <w:lvlJc w:val="left"/>
+      <w:pPr>
+        <w:ind w:left="720" w:hanging="360"/>
+      </w:pPr>
+      <w:rPr>
+        <w:rFonts w:ascii="Symbol" w:hAnsi="Symbol" w:hint="default"/>
+      </w:rPr>
+    </w:lvl>
+    <w:lvl w:ilvl="1" w:tplc="44090003">
+      <w:start w:val="1"/>
+      <w:numFmt w:val="bullet"/>
+      <w:lvlText w:val="o"/>
+      <w:lvlJc w:val="left"/>
+      <w:pPr>
+        <w:ind w:left="1440" w:hanging="360"/>
+      </w:pPr>
+      <w:rPr>
+        <w:rFonts w:ascii="Courier New" w:hAnsi="Courier New" w:cs="Courier New" w:hint="default"/>
+      </w:rPr>
+    </w:lvl>
+    <w:lvl w:ilvl="2" w:tplc="44090005" w:tentative="1">
+      <w:start w:val="1"/>
+      <w:numFmt w:val="bullet"/>
+      <w:lvlText w:val=""/>
+      <w:lvlJc w:val="left"/>
+      <w:pPr>
+        <w:ind w:left="2160" w:hanging="360"/>
+      </w:pPr>
+      <w:rPr>
+        <w:rFonts w:ascii="Wingdings" w:hAnsi="Wingdings" w:hint="default"/>
+      </w:rPr>
+    </w:lvl>
+    <w:lvl w:ilvl="3" w:tplc="44090001" w:tentative="1">
+      <w:start w:val="1"/>
+      <w:numFmt w:val="bullet"/>
+      <w:lvlText w:val=""/>
+      <w:lvlJc w:val="left"/>
+      <w:pPr>
+        <w:ind w:left="2880" w:hanging="360"/>
+      </w:pPr>
+      <w:rPr>
+        <w:rFonts w:ascii="Symbol" w:hAnsi="Symbol" w:hint="default"/>
+      </w:rPr>
+    </w:lvl>
+    <w:lvl w:ilvl="4" w:tplc="44090003" w:tentative="1">
+      <w:start w:val="1"/>
+      <w:numFmt w:val="bullet"/>
+      <w:lvlText w:val="o"/>
+      <w:lvlJc w:val="left"/>
+      <w:pPr>
+        <w:ind w:left="3600" w:hanging="360"/>
+      </w:pPr>
+      <w:rPr>
+        <w:rFonts w:ascii="Courier New" w:hAnsi="Courier New" w:cs="Courier New" w:hint="default"/>
+      </w:rPr>
+    </w:lvl>
+    <w:lvl w:ilvl="5" w:tplc="44090005" w:tentative="1">
+      <w:start w:val="1"/>
+      <w:numFmt w:val="bullet"/>
+      <w:lvlText w:val=""/>
+      <w:lvlJc w:val="left"/>
+      <w:pPr>
+        <w:ind w:left="4320" w:hanging="360"/>
+      </w:pPr>
+      <w:rPr>
+        <w:rFonts w:ascii="Wingdings" w:hAnsi="Wingdings" w:hint="default"/>
+      </w:rPr>
+    </w:lvl>
+    <w:lvl w:ilvl="6" w:tplc="44090001" w:tentative="1">
+      <w:start w:val="1"/>
+      <w:numFmt w:val="bullet"/>
+      <w:lvlText w:val=""/>
+      <w:lvlJc w:val="left"/>
+      <w:pPr>
+        <w:ind w:left="5040" w:hanging="360"/>
+      </w:pPr>
+      <w:rPr>
+        <w:rFonts w:ascii="Symbol" w:hAnsi="Symbol" w:hint="default"/>
+      </w:rPr>
+    </w:lvl>
+    <w:lvl w:ilvl="7" w:tplc="44090003" w:tentative="1">
+      <w:start w:val="1"/>
+      <w:numFmt w:val="bullet"/>
+      <w:lvlText w:val="o"/>
+      <w:lvlJc w:val="left"/>
+      <w:pPr>
+        <w:ind w:left="5760" w:hanging="360"/>
+      </w:pPr>
+      <w:rPr>
+        <w:rFonts w:ascii="Courier New" w:hAnsi="Courier New" w:cs="Courier New" w:hint="default"/>
+      </w:rPr>
+    </w:lvl>
+    <w:lvl w:ilvl="8" w:tplc="44090005" w:tentative="1">
+      <w:start w:val="1"/>
+      <w:numFmt w:val="bullet"/>
+      <w:lvlText w:val=""/>
+      <w:lvlJc w:val="left"/>
+      <w:pPr>
+        <w:ind w:left="6480" w:hanging="360"/>
+      </w:pPr>
+      <w:rPr>
+        <w:rFonts w:ascii="Wingdings" w:hAnsi="Wingdings" w:hint="default"/>
+      </w:rPr>
+    </w:lvl>
+  </w:abstractNum>
+  <w:abstractNum w:abstractNumId="2" w15:restartNumberingAfterBreak="0">
     <w:nsid w:val="2DD50EAB"/>
     <w:multiLevelType w:val="hybridMultilevel"/>
     <w:tmpl w:val="B672CD4C"/>
@@ -805,7 +2024,7 @@
       </w:pPr>
     </w:lvl>
   </w:abstractNum>
-  <w:abstractNum w:abstractNumId="2" w15:restartNumberingAfterBreak="0">
+  <w:abstractNum w:abstractNumId="3" w15:restartNumberingAfterBreak="0">
     <w:nsid w:val="40A66BE1"/>
     <w:multiLevelType w:val="hybridMultilevel"/>
     <w:tmpl w:val="AA62DDE0"/>
@@ -822,6 +2041,119 @@
       </w:rPr>
     </w:lvl>
     <w:lvl w:ilvl="1" w:tplc="44090003" w:tentative="1">
+      <w:start w:val="1"/>
+      <w:numFmt w:val="bullet"/>
+      <w:lvlText w:val="o"/>
+      <w:lvlJc w:val="left"/>
+      <w:pPr>
+        <w:ind w:left="1440" w:hanging="360"/>
+      </w:pPr>
+      <w:rPr>
+        <w:rFonts w:ascii="Courier New" w:hAnsi="Courier New" w:cs="Courier New" w:hint="default"/>
+      </w:rPr>
+    </w:lvl>
+    <w:lvl w:ilvl="2" w:tplc="44090005" w:tentative="1">
+      <w:start w:val="1"/>
+      <w:numFmt w:val="bullet"/>
+      <w:lvlText w:val=""/>
+      <w:lvlJc w:val="left"/>
+      <w:pPr>
+        <w:ind w:left="2160" w:hanging="360"/>
+      </w:pPr>
+      <w:rPr>
+        <w:rFonts w:ascii="Wingdings" w:hAnsi="Wingdings" w:hint="default"/>
+      </w:rPr>
+    </w:lvl>
+    <w:lvl w:ilvl="3" w:tplc="44090001" w:tentative="1">
+      <w:start w:val="1"/>
+      <w:numFmt w:val="bullet"/>
+      <w:lvlText w:val=""/>
+      <w:lvlJc w:val="left"/>
+      <w:pPr>
+        <w:ind w:left="2880" w:hanging="360"/>
+      </w:pPr>
+      <w:rPr>
+        <w:rFonts w:ascii="Symbol" w:hAnsi="Symbol" w:hint="default"/>
+      </w:rPr>
+    </w:lvl>
+    <w:lvl w:ilvl="4" w:tplc="44090003" w:tentative="1">
+      <w:start w:val="1"/>
+      <w:numFmt w:val="bullet"/>
+      <w:lvlText w:val="o"/>
+      <w:lvlJc w:val="left"/>
+      <w:pPr>
+        <w:ind w:left="3600" w:hanging="360"/>
+      </w:pPr>
+      <w:rPr>
+        <w:rFonts w:ascii="Courier New" w:hAnsi="Courier New" w:cs="Courier New" w:hint="default"/>
+      </w:rPr>
+    </w:lvl>
+    <w:lvl w:ilvl="5" w:tplc="44090005" w:tentative="1">
+      <w:start w:val="1"/>
+      <w:numFmt w:val="bullet"/>
+      <w:lvlText w:val=""/>
+      <w:lvlJc w:val="left"/>
+      <w:pPr>
+        <w:ind w:left="4320" w:hanging="360"/>
+      </w:pPr>
+      <w:rPr>
+        <w:rFonts w:ascii="Wingdings" w:hAnsi="Wingdings" w:hint="default"/>
+      </w:rPr>
+    </w:lvl>
+    <w:lvl w:ilvl="6" w:tplc="44090001" w:tentative="1">
+      <w:start w:val="1"/>
+      <w:numFmt w:val="bullet"/>
+      <w:lvlText w:val=""/>
+      <w:lvlJc w:val="left"/>
+      <w:pPr>
+        <w:ind w:left="5040" w:hanging="360"/>
+      </w:pPr>
+      <w:rPr>
+        <w:rFonts w:ascii="Symbol" w:hAnsi="Symbol" w:hint="default"/>
+      </w:rPr>
+    </w:lvl>
+    <w:lvl w:ilvl="7" w:tplc="44090003" w:tentative="1">
+      <w:start w:val="1"/>
+      <w:numFmt w:val="bullet"/>
+      <w:lvlText w:val="o"/>
+      <w:lvlJc w:val="left"/>
+      <w:pPr>
+        <w:ind w:left="5760" w:hanging="360"/>
+      </w:pPr>
+      <w:rPr>
+        <w:rFonts w:ascii="Courier New" w:hAnsi="Courier New" w:cs="Courier New" w:hint="default"/>
+      </w:rPr>
+    </w:lvl>
+    <w:lvl w:ilvl="8" w:tplc="44090005" w:tentative="1">
+      <w:start w:val="1"/>
+      <w:numFmt w:val="bullet"/>
+      <w:lvlText w:val=""/>
+      <w:lvlJc w:val="left"/>
+      <w:pPr>
+        <w:ind w:left="6480" w:hanging="360"/>
+      </w:pPr>
+      <w:rPr>
+        <w:rFonts w:ascii="Wingdings" w:hAnsi="Wingdings" w:hint="default"/>
+      </w:rPr>
+    </w:lvl>
+  </w:abstractNum>
+  <w:abstractNum w:abstractNumId="4" w15:restartNumberingAfterBreak="0">
+    <w:nsid w:val="5A5B2178"/>
+    <w:multiLevelType w:val="hybridMultilevel"/>
+    <w:tmpl w:val="5178FD98"/>
+    <w:lvl w:ilvl="0" w:tplc="44090001">
+      <w:start w:val="1"/>
+      <w:numFmt w:val="bullet"/>
+      <w:lvlText w:val=""/>
+      <w:lvlJc w:val="left"/>
+      <w:pPr>
+        <w:ind w:left="720" w:hanging="360"/>
+      </w:pPr>
+      <w:rPr>
+        <w:rFonts w:ascii="Symbol" w:hAnsi="Symbol" w:hint="default"/>
+      </w:rPr>
+    </w:lvl>
+    <w:lvl w:ilvl="1" w:tplc="44090003">
       <w:start w:val="1"/>
       <w:numFmt w:val="bullet"/>
       <w:lvlText w:val="o"/>
@@ -922,10 +2254,16 @@
     <w:abstractNumId w:val="0"/>
   </w:num>
   <w:num w:numId="2" w16cid:durableId="294214790">
+    <w:abstractNumId w:val="3"/>
+  </w:num>
+  <w:num w:numId="3" w16cid:durableId="2037391183">
     <w:abstractNumId w:val="2"/>
   </w:num>
-  <w:num w:numId="3" w16cid:durableId="2037391183">
+  <w:num w:numId="4" w16cid:durableId="1335766773">
     <w:abstractNumId w:val="1"/>
+  </w:num>
+  <w:num w:numId="5" w16cid:durableId="1561285519">
+    <w:abstractNumId w:val="4"/>
   </w:num>
 </w:numbering>
 </file>
@@ -1330,8 +2668,13 @@
   <w:style w:type="paragraph" w:default="1" w:styleId="Normal">
     <w:name w:val="Normal"/>
     <w:qFormat/>
-    <w:rsid w:val="005510BF"/>
+    <w:rsid w:val="00920C9D"/>
+    <w:pPr>
+      <w:spacing w:line="276" w:lineRule="auto"/>
+      <w:jc w:val="both"/>
+    </w:pPr>
     <w:rPr>
+      <w:rFonts w:ascii="Arial" w:hAnsi="Arial" w:cs="Arial"/>
       <w:sz w:val="24"/>
       <w:szCs w:val="24"/>
       <w:lang w:val="en-US"/>
@@ -1344,7 +2687,7 @@
     <w:link w:val="Heading1Char"/>
     <w:uiPriority w:val="9"/>
     <w:qFormat/>
-    <w:rsid w:val="00A15A50"/>
+    <w:rsid w:val="00920C9D"/>
     <w:pPr>
       <w:keepNext/>
       <w:keepLines/>
@@ -1352,7 +2695,7 @@
       <w:outlineLvl w:val="0"/>
     </w:pPr>
     <w:rPr>
-      <w:rFonts w:asciiTheme="majorHAnsi" w:eastAsiaTheme="majorEastAsia" w:hAnsiTheme="majorHAnsi" w:cstheme="majorBidi"/>
+      <w:rFonts w:eastAsiaTheme="majorEastAsia"/>
       <w:color w:val="2F5496" w:themeColor="accent1" w:themeShade="BF"/>
       <w:sz w:val="40"/>
       <w:szCs w:val="40"/>
@@ -1366,7 +2709,7 @@
     <w:uiPriority w:val="9"/>
     <w:unhideWhenUsed/>
     <w:qFormat/>
-    <w:rsid w:val="00A15A50"/>
+    <w:rsid w:val="000C6484"/>
     <w:pPr>
       <w:keepNext/>
       <w:keepLines/>
@@ -1374,7 +2717,7 @@
       <w:outlineLvl w:val="1"/>
     </w:pPr>
     <w:rPr>
-      <w:rFonts w:asciiTheme="majorHAnsi" w:eastAsiaTheme="majorEastAsia" w:hAnsiTheme="majorHAnsi" w:cstheme="majorBidi"/>
+      <w:rFonts w:eastAsiaTheme="majorEastAsia"/>
       <w:color w:val="2F5496" w:themeColor="accent1" w:themeShade="BF"/>
       <w:sz w:val="32"/>
       <w:szCs w:val="32"/>
@@ -1386,10 +2729,9 @@
     <w:next w:val="Normal"/>
     <w:link w:val="Heading3Char"/>
     <w:uiPriority w:val="9"/>
-    <w:semiHidden/>
     <w:unhideWhenUsed/>
     <w:qFormat/>
-    <w:rsid w:val="00A15A50"/>
+    <w:rsid w:val="006A7B0A"/>
     <w:pPr>
       <w:keepNext/>
       <w:keepLines/>
@@ -1567,12 +2909,13 @@
     <w:basedOn w:val="DefaultParagraphFont"/>
     <w:link w:val="Heading1"/>
     <w:uiPriority w:val="9"/>
-    <w:rsid w:val="00A15A50"/>
+    <w:rsid w:val="00920C9D"/>
     <w:rPr>
-      <w:rFonts w:asciiTheme="majorHAnsi" w:eastAsiaTheme="majorEastAsia" w:hAnsiTheme="majorHAnsi" w:cstheme="majorBidi"/>
+      <w:rFonts w:ascii="Arial" w:eastAsiaTheme="majorEastAsia" w:hAnsi="Arial" w:cs="Arial"/>
       <w:color w:val="2F5496" w:themeColor="accent1" w:themeShade="BF"/>
       <w:sz w:val="40"/>
       <w:szCs w:val="40"/>
+      <w:lang w:val="en-US"/>
     </w:rPr>
   </w:style>
   <w:style w:type="character" w:customStyle="1" w:styleId="Heading2Char">
@@ -1580,12 +2923,13 @@
     <w:basedOn w:val="DefaultParagraphFont"/>
     <w:link w:val="Heading2"/>
     <w:uiPriority w:val="9"/>
-    <w:rsid w:val="00A15A50"/>
+    <w:rsid w:val="000C6484"/>
     <w:rPr>
-      <w:rFonts w:asciiTheme="majorHAnsi" w:eastAsiaTheme="majorEastAsia" w:hAnsiTheme="majorHAnsi" w:cstheme="majorBidi"/>
+      <w:rFonts w:ascii="Arial" w:eastAsiaTheme="majorEastAsia" w:hAnsi="Arial" w:cs="Arial"/>
       <w:color w:val="2F5496" w:themeColor="accent1" w:themeShade="BF"/>
       <w:sz w:val="32"/>
       <w:szCs w:val="32"/>
+      <w:lang w:val="en-US"/>
     </w:rPr>
   </w:style>
   <w:style w:type="character" w:customStyle="1" w:styleId="Heading3Char">
@@ -1593,13 +2937,13 @@
     <w:basedOn w:val="DefaultParagraphFont"/>
     <w:link w:val="Heading3"/>
     <w:uiPriority w:val="9"/>
-    <w:semiHidden/>
-    <w:rsid w:val="00A15A50"/>
+    <w:rsid w:val="006A7B0A"/>
     <w:rPr>
-      <w:rFonts w:eastAsiaTheme="majorEastAsia" w:cstheme="majorBidi"/>
+      <w:rFonts w:ascii="Arial" w:eastAsiaTheme="majorEastAsia" w:hAnsi="Arial" w:cstheme="majorBidi"/>
       <w:color w:val="2F5496" w:themeColor="accent1" w:themeShade="BF"/>
       <w:sz w:val="28"/>
       <w:szCs w:val="28"/>
+      <w:lang w:val="en-US"/>
     </w:rPr>
   </w:style>
   <w:style w:type="character" w:customStyle="1" w:styleId="Heading4Char">

</xml_diff>

<commit_message>
Update Computing Project Report - WONG KAI LUN.docx
</commit_message>
<xml_diff>
--- a/report/Computing Project Report - WONG KAI LUN.docx
+++ b/report/Computing Project Report - WONG KAI LUN.docx
@@ -4439,6 +4439,97 @@
     </w:tbl>
     <w:p/>
     <w:p>
+      <w:pPr>
+        <w:pStyle w:val="Heading1"/>
+      </w:pPr>
+      <w:proofErr w:type="spellStart"/>
+      <w:r>
+        <w:t>Youtube</w:t>
+      </w:r>
+      <w:proofErr w:type="spellEnd"/>
+      <w:r>
+        <w:t xml:space="preserve"> Link Demo Video</w:t>
+      </w:r>
+    </w:p>
+    <w:tbl>
+      <w:tblPr>
+        <w:tblStyle w:val="TableGrid"/>
+        <w:tblW w:w="0" w:type="auto"/>
+        <w:tblLook w:val="04A0" w:firstRow="1" w:lastRow="0" w:firstColumn="1" w:lastColumn="0" w:noHBand="0" w:noVBand="1"/>
+      </w:tblPr>
+      <w:tblGrid>
+        <w:gridCol w:w="9016"/>
+      </w:tblGrid>
+      <w:tr>
+        <w:tc>
+          <w:tcPr>
+            <w:tcW w:w="9016" w:type="dxa"/>
+          </w:tcPr>
+          <w:p/>
+          <w:p>
+            <w:hyperlink r:id="rId8" w:history="1">
+              <w:r>
+                <w:rPr>
+                  <w:rStyle w:val="Hyperlink"/>
+                </w:rPr>
+                <w:t>https://youtu.be/eMCVqLEZRVQ</w:t>
+              </w:r>
+            </w:hyperlink>
+            <w:r>
+              <w:t xml:space="preserve"> </w:t>
+            </w:r>
+          </w:p>
+          <w:p/>
+        </w:tc>
+      </w:tr>
+    </w:tbl>
+    <w:p/>
+    <w:p>
+      <w:pPr>
+        <w:pStyle w:val="Heading1"/>
+      </w:pPr>
+      <w:proofErr w:type="spellStart"/>
+      <w:r>
+        <w:t>PebblePad</w:t>
+      </w:r>
+      <w:proofErr w:type="spellEnd"/>
+      <w:r>
+        <w:t xml:space="preserve"> Link</w:t>
+      </w:r>
+    </w:p>
+    <w:tbl>
+      <w:tblPr>
+        <w:tblStyle w:val="TableGrid"/>
+        <w:tblW w:w="0" w:type="auto"/>
+        <w:tblLook w:val="04A0" w:firstRow="1" w:lastRow="0" w:firstColumn="1" w:lastColumn="0" w:noHBand="0" w:noVBand="1"/>
+      </w:tblPr>
+      <w:tblGrid>
+        <w:gridCol w:w="9016"/>
+      </w:tblGrid>
+      <w:tr>
+        <w:tc>
+          <w:tcPr>
+            <w:tcW w:w="9016" w:type="dxa"/>
+          </w:tcPr>
+          <w:p/>
+          <w:p>
+            <w:hyperlink r:id="rId9" w:history="1">
+              <w:r>
+                <w:rPr>
+                  <w:rStyle w:val="Hyperlink"/>
+                </w:rPr>
+                <w:t>https://v3.pebblepad.co.uk/spa/#/public/mtw79ZnrbmZsRypkRwM97rfxww</w:t>
+              </w:r>
+            </w:hyperlink>
+            <w:r>
+              <w:t xml:space="preserve"> </w:t>
+            </w:r>
+          </w:p>
+          <w:p/>
+        </w:tc>
+      </w:tr>
+    </w:tbl>
+    <w:p>
       <w:r>
         <w:br w:type="page"/>
       </w:r>
@@ -4707,11 +4798,9 @@
       <w:r>
         <w:t xml:space="preserve"> project aims to provide cybersecurity awareness training that both keeps the user engaged and is also available for free online. The target users of this project </w:t>
       </w:r>
-      <w:proofErr w:type="gramStart"/>
       <w:r>
         <w:t>is</w:t>
       </w:r>
-      <w:proofErr w:type="gramEnd"/>
       <w:r>
         <w:t xml:space="preserve"> the general public.</w:t>
       </w:r>
@@ -4876,7 +4965,7 @@
           <w:numId w:val="5"/>
         </w:numPr>
       </w:pPr>
-      <w:hyperlink r:id="rId8" w:history="1">
+      <w:hyperlink r:id="rId10" w:history="1">
         <w:r>
           <w:rPr>
             <w:rStyle w:val="Hyperlink"/>
@@ -4956,7 +5045,7 @@
           <w:numId w:val="4"/>
         </w:numPr>
       </w:pPr>
-      <w:hyperlink r:id="rId9" w:history="1">
+      <w:hyperlink r:id="rId11" w:history="1">
         <w:r>
           <w:rPr>
             <w:rStyle w:val="Hyperlink"/>
@@ -5004,7 +5093,7 @@
           <w:numId w:val="4"/>
         </w:numPr>
       </w:pPr>
-      <w:hyperlink r:id="rId10" w:history="1">
+      <w:hyperlink r:id="rId12" w:history="1">
         <w:r>
           <w:rPr>
             <w:rStyle w:val="Hyperlink"/>
@@ -5180,7 +5269,7 @@
                     <pic:cNvPicPr/>
                   </pic:nvPicPr>
                   <pic:blipFill>
-                    <a:blip r:embed="rId11" cstate="print">
+                    <a:blip r:embed="rId13" cstate="print">
                       <a:extLst>
                         <a:ext uri="{28A0092B-C50C-407E-A947-70E740481C1C}">
                           <a14:useLocalDpi xmlns:a14="http://schemas.microsoft.com/office/drawing/2010/main" val="0"/>
@@ -6175,7 +6264,7 @@
                     <pic:cNvPicPr/>
                   </pic:nvPicPr>
                   <pic:blipFill>
-                    <a:blip r:embed="rId12">
+                    <a:blip r:embed="rId14">
                       <a:extLst>
                         <a:ext uri="{28A0092B-C50C-407E-A947-70E740481C1C}">
                           <a14:useLocalDpi xmlns:a14="http://schemas.microsoft.com/office/drawing/2010/main" val="0"/>
@@ -6371,310 +6460,6 @@
                 <pic:pic xmlns:pic="http://schemas.openxmlformats.org/drawingml/2006/picture">
                   <pic:nvPicPr>
                     <pic:cNvPr id="1133878345" name="Picture 1133878345"/>
-                    <pic:cNvPicPr/>
-                  </pic:nvPicPr>
-                  <pic:blipFill>
-                    <a:blip r:embed="rId13" cstate="print">
-                      <a:extLst>
-                        <a:ext uri="{28A0092B-C50C-407E-A947-70E740481C1C}">
-                          <a14:useLocalDpi xmlns:a14="http://schemas.microsoft.com/office/drawing/2010/main" val="0"/>
-                        </a:ext>
-                      </a:extLst>
-                    </a:blip>
-                    <a:stretch>
-                      <a:fillRect/>
-                    </a:stretch>
-                  </pic:blipFill>
-                  <pic:spPr>
-                    <a:xfrm>
-                      <a:off x="0" y="0"/>
-                      <a:ext cx="5731510" cy="3223895"/>
-                    </a:xfrm>
-                    <a:prstGeom prst="rect">
-                      <a:avLst/>
-                    </a:prstGeom>
-                  </pic:spPr>
-                </pic:pic>
-              </a:graphicData>
-            </a:graphic>
-          </wp:inline>
-        </w:drawing>
-      </w:r>
-    </w:p>
-    <w:p>
-      <w:pPr>
-        <w:pStyle w:val="ImageCaptions"/>
-      </w:pPr>
-      <w:r>
-        <w:t>Figure 7.1.1.1.1: Screenshot of Desktop scene</w:t>
-      </w:r>
-    </w:p>
-    <w:p/>
-    <w:p>
-      <w:pPr>
-        <w:spacing w:line="259" w:lineRule="auto"/>
-        <w:jc w:val="left"/>
-        <w:rPr>
-          <w:rFonts w:eastAsiaTheme="majorEastAsia" w:cstheme="majorBidi"/>
-          <w:i/>
-          <w:iCs/>
-          <w:color w:val="2F5496" w:themeColor="accent1" w:themeShade="BF"/>
-        </w:rPr>
-      </w:pPr>
-      <w:r>
-        <w:br w:type="page"/>
-      </w:r>
-    </w:p>
-    <w:p>
-      <w:pPr>
-        <w:pStyle w:val="Heading4"/>
-      </w:pPr>
-      <w:r>
-        <w:lastRenderedPageBreak/>
-        <w:t>7.1.1.</w:t>
-      </w:r>
-      <w:r>
-        <w:t>2</w:t>
-      </w:r>
-      <w:r>
-        <w:t xml:space="preserve"> </w:t>
-      </w:r>
-      <w:r>
-        <w:t>EmailClient</w:t>
-      </w:r>
-    </w:p>
-    <w:p>
-      <w:r>
-        <w:t xml:space="preserve">The EmailClient is a program </w:t>
-      </w:r>
-      <w:r>
-        <w:t xml:space="preserve">which contains the main tasks for the player. The player has to read through emails, download safe, legitimate files and report </w:t>
-      </w:r>
-      <w:r>
-        <w:t>phishing emails</w:t>
-      </w:r>
-      <w:r>
-        <w:t>.</w:t>
-      </w:r>
-    </w:p>
-    <w:p>
-      <w:r>
-        <w:rPr>
-          <w:noProof/>
-        </w:rPr>
-        <w:drawing>
-          <wp:inline distT="0" distB="0" distL="0" distR="0" wp14:anchorId="6135CE36" wp14:editId="19BF545E">
-            <wp:extent cx="5731510" cy="3223895"/>
-            <wp:effectExtent l="0" t="0" r="2540" b="0"/>
-            <wp:docPr id="706547006" name="Picture 2"/>
-            <wp:cNvGraphicFramePr>
-              <a:graphicFrameLocks xmlns:a="http://schemas.openxmlformats.org/drawingml/2006/main" noChangeAspect="1"/>
-            </wp:cNvGraphicFramePr>
-            <a:graphic xmlns:a="http://schemas.openxmlformats.org/drawingml/2006/main">
-              <a:graphicData uri="http://schemas.openxmlformats.org/drawingml/2006/picture">
-                <pic:pic xmlns:pic="http://schemas.openxmlformats.org/drawingml/2006/picture">
-                  <pic:nvPicPr>
-                    <pic:cNvPr id="706547006" name="Picture 706547006"/>
-                    <pic:cNvPicPr/>
-                  </pic:nvPicPr>
-                  <pic:blipFill>
-                    <a:blip r:embed="rId14" cstate="print">
-                      <a:extLst>
-                        <a:ext uri="{28A0092B-C50C-407E-A947-70E740481C1C}">
-                          <a14:useLocalDpi xmlns:a14="http://schemas.microsoft.com/office/drawing/2010/main" val="0"/>
-                        </a:ext>
-                      </a:extLst>
-                    </a:blip>
-                    <a:stretch>
-                      <a:fillRect/>
-                    </a:stretch>
-                  </pic:blipFill>
-                  <pic:spPr>
-                    <a:xfrm>
-                      <a:off x="0" y="0"/>
-                      <a:ext cx="5731510" cy="3223895"/>
-                    </a:xfrm>
-                    <a:prstGeom prst="rect">
-                      <a:avLst/>
-                    </a:prstGeom>
-                  </pic:spPr>
-                </pic:pic>
-              </a:graphicData>
-            </a:graphic>
-          </wp:inline>
-        </w:drawing>
-      </w:r>
-    </w:p>
-    <w:p>
-      <w:pPr>
-        <w:pStyle w:val="ImageCaptions"/>
-      </w:pPr>
-      <w:r>
-        <w:t xml:space="preserve">Figure 7.1.1.2.1: </w:t>
-      </w:r>
-      <w:r>
-        <w:t>Screenshot of EmailClient with an opened email</w:t>
-      </w:r>
-    </w:p>
-    <w:p/>
-    <w:p>
-      <w:pPr>
-        <w:pStyle w:val="Heading4"/>
-      </w:pPr>
-      <w:r>
-        <w:t>7.1.1.</w:t>
-      </w:r>
-      <w:r>
-        <w:t>3</w:t>
-      </w:r>
-      <w:r>
-        <w:t xml:space="preserve"> </w:t>
-      </w:r>
-      <w:r>
-        <w:t>Files</w:t>
-      </w:r>
-    </w:p>
-    <w:p>
-      <w:r>
-        <w:t xml:space="preserve">Files </w:t>
-      </w:r>
-      <w:r>
-        <w:t xml:space="preserve">are game objects the player </w:t>
-      </w:r>
-      <w:r>
-        <w:t>collect in order to submit to a designated recipient and progress the day.</w:t>
-      </w:r>
-      <w:r>
-        <w:t xml:space="preserve"> The Files sent to the player consist of different types that are either neutral or harmful</w:t>
-      </w:r>
-      <w:r>
-        <w:t xml:space="preserve"> to their fictional work computer.</w:t>
-      </w:r>
-    </w:p>
-    <w:p/>
-    <w:p>
-      <w:pPr>
-        <w:pStyle w:val="Heading4"/>
-      </w:pPr>
-      <w:r>
-        <w:t>7.1.1.</w:t>
-      </w:r>
-      <w:r>
-        <w:t>4</w:t>
-      </w:r>
-      <w:r>
-        <w:t xml:space="preserve"> </w:t>
-      </w:r>
-      <w:r>
-        <w:t>Inventory</w:t>
-      </w:r>
-    </w:p>
-    <w:p>
-      <w:r>
-        <w:t>The Inventory is a program where the downloaded files are kept.</w:t>
-      </w:r>
-      <w:r>
-        <w:t xml:space="preserve"> Files within the inventory can either be dragged out and attached to an outbound email, or deleted and quarantined in the RecyclingBin.</w:t>
-      </w:r>
-    </w:p>
-    <w:p/>
-    <w:p>
-      <w:pPr>
-        <w:pStyle w:val="Heading4"/>
-      </w:pPr>
-      <w:r>
-        <w:t>7.1.1.</w:t>
-      </w:r>
-      <w:r>
-        <w:t>5</w:t>
-      </w:r>
-      <w:r>
-        <w:t xml:space="preserve"> </w:t>
-      </w:r>
-      <w:r>
-        <w:t>Recycling</w:t>
-      </w:r>
-      <w:r>
-        <w:t>Bin</w:t>
-      </w:r>
-    </w:p>
-    <w:p>
-      <w:r>
-        <w:t xml:space="preserve">The RecyclingBin is another program where Files deleted from Inventory are sent to. Harmful Files within the RecyclingBin are quarantined, </w:t>
-      </w:r>
-      <w:r>
-        <w:t>therefore their harmful effects cannot be triggered.</w:t>
-      </w:r>
-    </w:p>
-    <w:p/>
-    <w:p>
-      <w:pPr>
-        <w:pStyle w:val="Heading4"/>
-      </w:pPr>
-      <w:r>
-        <w:lastRenderedPageBreak/>
-        <w:t>7.1.1.</w:t>
-      </w:r>
-      <w:r>
-        <w:t>6</w:t>
-      </w:r>
-      <w:r>
-        <w:t xml:space="preserve"> </w:t>
-      </w:r>
-      <w:r>
-        <w:t xml:space="preserve">Important </w:t>
-      </w:r>
-      <w:r>
-        <w:t>Email</w:t>
-      </w:r>
-    </w:p>
-    <w:p>
-      <w:r>
-        <w:t xml:space="preserve">In the game story, </w:t>
-      </w:r>
-      <w:r>
-        <w:t xml:space="preserve">a non-player character (NPC) called Nazrin, is a </w:t>
-      </w:r>
-      <w:r>
-        <w:t xml:space="preserve">coworker of the player from the same company. He is the designated recipient for the safe </w:t>
-      </w:r>
-      <w:r>
-        <w:t>F</w:t>
-      </w:r>
-      <w:r>
-        <w:t xml:space="preserve">iles the player downloads and </w:t>
-      </w:r>
-      <w:r>
-        <w:t>sends.</w:t>
-      </w:r>
-      <w:r>
-        <w:t xml:space="preserve"> After the ‘Send’ button is clicked, the day ends </w:t>
-      </w:r>
-      <w:r>
-        <w:t>and proceeds to the next</w:t>
-      </w:r>
-      <w:r>
-        <w:t xml:space="preserve"> day.</w:t>
-      </w:r>
-    </w:p>
-    <w:p>
-      <w:r>
-        <w:rPr>
-          <w:noProof/>
-        </w:rPr>
-        <w:drawing>
-          <wp:inline distT="0" distB="0" distL="0" distR="0" wp14:anchorId="0CE5B72C" wp14:editId="1E6D6968">
-            <wp:extent cx="5731510" cy="3223895"/>
-            <wp:effectExtent l="0" t="0" r="2540" b="0"/>
-            <wp:docPr id="211871018" name="Picture 3"/>
-            <wp:cNvGraphicFramePr>
-              <a:graphicFrameLocks xmlns:a="http://schemas.openxmlformats.org/drawingml/2006/main" noChangeAspect="1"/>
-            </wp:cNvGraphicFramePr>
-            <a:graphic xmlns:a="http://schemas.openxmlformats.org/drawingml/2006/main">
-              <a:graphicData uri="http://schemas.openxmlformats.org/drawingml/2006/picture">
-                <pic:pic xmlns:pic="http://schemas.openxmlformats.org/drawingml/2006/picture">
-                  <pic:nvPicPr>
-                    <pic:cNvPr id="211871018" name="Picture 211871018"/>
                     <pic:cNvPicPr/>
                   </pic:nvPicPr>
                   <pic:blipFill>
@@ -6710,6 +6495,310 @@
         <w:pStyle w:val="ImageCaptions"/>
       </w:pPr>
       <w:r>
+        <w:t>Figure 7.1.1.1.1: Screenshot of Desktop scene</w:t>
+      </w:r>
+    </w:p>
+    <w:p/>
+    <w:p>
+      <w:pPr>
+        <w:spacing w:line="259" w:lineRule="auto"/>
+        <w:jc w:val="left"/>
+        <w:rPr>
+          <w:rFonts w:eastAsiaTheme="majorEastAsia" w:cstheme="majorBidi"/>
+          <w:i/>
+          <w:iCs/>
+          <w:color w:val="2F5496" w:themeColor="accent1" w:themeShade="BF"/>
+        </w:rPr>
+      </w:pPr>
+      <w:r>
+        <w:br w:type="page"/>
+      </w:r>
+    </w:p>
+    <w:p>
+      <w:pPr>
+        <w:pStyle w:val="Heading4"/>
+      </w:pPr>
+      <w:r>
+        <w:lastRenderedPageBreak/>
+        <w:t>7.1.1.</w:t>
+      </w:r>
+      <w:r>
+        <w:t>2</w:t>
+      </w:r>
+      <w:r>
+        <w:t xml:space="preserve"> </w:t>
+      </w:r>
+      <w:r>
+        <w:t>EmailClient</w:t>
+      </w:r>
+    </w:p>
+    <w:p>
+      <w:r>
+        <w:t xml:space="preserve">The EmailClient is a program </w:t>
+      </w:r>
+      <w:r>
+        <w:t xml:space="preserve">which contains the main tasks for the player. The player has to read through emails, download safe, legitimate files and report </w:t>
+      </w:r>
+      <w:r>
+        <w:t>phishing emails</w:t>
+      </w:r>
+      <w:r>
+        <w:t>.</w:t>
+      </w:r>
+    </w:p>
+    <w:p>
+      <w:r>
+        <w:rPr>
+          <w:noProof/>
+        </w:rPr>
+        <w:drawing>
+          <wp:inline distT="0" distB="0" distL="0" distR="0" wp14:anchorId="6135CE36" wp14:editId="19BF545E">
+            <wp:extent cx="5731510" cy="3223895"/>
+            <wp:effectExtent l="0" t="0" r="2540" b="0"/>
+            <wp:docPr id="706547006" name="Picture 2"/>
+            <wp:cNvGraphicFramePr>
+              <a:graphicFrameLocks xmlns:a="http://schemas.openxmlformats.org/drawingml/2006/main" noChangeAspect="1"/>
+            </wp:cNvGraphicFramePr>
+            <a:graphic xmlns:a="http://schemas.openxmlformats.org/drawingml/2006/main">
+              <a:graphicData uri="http://schemas.openxmlformats.org/drawingml/2006/picture">
+                <pic:pic xmlns:pic="http://schemas.openxmlformats.org/drawingml/2006/picture">
+                  <pic:nvPicPr>
+                    <pic:cNvPr id="706547006" name="Picture 706547006"/>
+                    <pic:cNvPicPr/>
+                  </pic:nvPicPr>
+                  <pic:blipFill>
+                    <a:blip r:embed="rId16" cstate="print">
+                      <a:extLst>
+                        <a:ext uri="{28A0092B-C50C-407E-A947-70E740481C1C}">
+                          <a14:useLocalDpi xmlns:a14="http://schemas.microsoft.com/office/drawing/2010/main" val="0"/>
+                        </a:ext>
+                      </a:extLst>
+                    </a:blip>
+                    <a:stretch>
+                      <a:fillRect/>
+                    </a:stretch>
+                  </pic:blipFill>
+                  <pic:spPr>
+                    <a:xfrm>
+                      <a:off x="0" y="0"/>
+                      <a:ext cx="5731510" cy="3223895"/>
+                    </a:xfrm>
+                    <a:prstGeom prst="rect">
+                      <a:avLst/>
+                    </a:prstGeom>
+                  </pic:spPr>
+                </pic:pic>
+              </a:graphicData>
+            </a:graphic>
+          </wp:inline>
+        </w:drawing>
+      </w:r>
+    </w:p>
+    <w:p>
+      <w:pPr>
+        <w:pStyle w:val="ImageCaptions"/>
+      </w:pPr>
+      <w:r>
+        <w:t xml:space="preserve">Figure 7.1.1.2.1: </w:t>
+      </w:r>
+      <w:r>
+        <w:t>Screenshot of EmailClient with an opened email</w:t>
+      </w:r>
+    </w:p>
+    <w:p/>
+    <w:p>
+      <w:pPr>
+        <w:pStyle w:val="Heading4"/>
+      </w:pPr>
+      <w:r>
+        <w:t>7.1.1.</w:t>
+      </w:r>
+      <w:r>
+        <w:t>3</w:t>
+      </w:r>
+      <w:r>
+        <w:t xml:space="preserve"> </w:t>
+      </w:r>
+      <w:r>
+        <w:t>Files</w:t>
+      </w:r>
+    </w:p>
+    <w:p>
+      <w:r>
+        <w:t xml:space="preserve">Files </w:t>
+      </w:r>
+      <w:r>
+        <w:t xml:space="preserve">are game objects the player </w:t>
+      </w:r>
+      <w:r>
+        <w:t>collect in order to submit to a designated recipient and progress the day.</w:t>
+      </w:r>
+      <w:r>
+        <w:t xml:space="preserve"> The Files sent to the player consist of different types that are either neutral or harmful</w:t>
+      </w:r>
+      <w:r>
+        <w:t xml:space="preserve"> to their fictional work computer.</w:t>
+      </w:r>
+    </w:p>
+    <w:p/>
+    <w:p>
+      <w:pPr>
+        <w:pStyle w:val="Heading4"/>
+      </w:pPr>
+      <w:r>
+        <w:t>7.1.1.</w:t>
+      </w:r>
+      <w:r>
+        <w:t>4</w:t>
+      </w:r>
+      <w:r>
+        <w:t xml:space="preserve"> </w:t>
+      </w:r>
+      <w:r>
+        <w:t>Inventory</w:t>
+      </w:r>
+    </w:p>
+    <w:p>
+      <w:r>
+        <w:t>The Inventory is a program where the downloaded files are kept.</w:t>
+      </w:r>
+      <w:r>
+        <w:t xml:space="preserve"> Files within the inventory can either be dragged out and attached to an outbound email, or deleted and quarantined in the RecyclingBin.</w:t>
+      </w:r>
+    </w:p>
+    <w:p/>
+    <w:p>
+      <w:pPr>
+        <w:pStyle w:val="Heading4"/>
+      </w:pPr>
+      <w:r>
+        <w:t>7.1.1.</w:t>
+      </w:r>
+      <w:r>
+        <w:t>5</w:t>
+      </w:r>
+      <w:r>
+        <w:t xml:space="preserve"> </w:t>
+      </w:r>
+      <w:r>
+        <w:t>Recycling</w:t>
+      </w:r>
+      <w:r>
+        <w:t>Bin</w:t>
+      </w:r>
+    </w:p>
+    <w:p>
+      <w:r>
+        <w:t xml:space="preserve">The RecyclingBin is another program where Files deleted from Inventory are sent to. Harmful Files within the RecyclingBin are quarantined, </w:t>
+      </w:r>
+      <w:r>
+        <w:t>therefore their harmful effects cannot be triggered.</w:t>
+      </w:r>
+    </w:p>
+    <w:p/>
+    <w:p>
+      <w:pPr>
+        <w:pStyle w:val="Heading4"/>
+      </w:pPr>
+      <w:r>
+        <w:lastRenderedPageBreak/>
+        <w:t>7.1.1.</w:t>
+      </w:r>
+      <w:r>
+        <w:t>6</w:t>
+      </w:r>
+      <w:r>
+        <w:t xml:space="preserve"> </w:t>
+      </w:r>
+      <w:r>
+        <w:t xml:space="preserve">Important </w:t>
+      </w:r>
+      <w:r>
+        <w:t>Email</w:t>
+      </w:r>
+    </w:p>
+    <w:p>
+      <w:r>
+        <w:t xml:space="preserve">In the game story, </w:t>
+      </w:r>
+      <w:r>
+        <w:t xml:space="preserve">a non-player character (NPC) called Nazrin, is a </w:t>
+      </w:r>
+      <w:r>
+        <w:t xml:space="preserve">coworker of the player from the same company. He is the designated recipient for the safe </w:t>
+      </w:r>
+      <w:r>
+        <w:t>F</w:t>
+      </w:r>
+      <w:r>
+        <w:t xml:space="preserve">iles the player downloads and </w:t>
+      </w:r>
+      <w:r>
+        <w:t>sends.</w:t>
+      </w:r>
+      <w:r>
+        <w:t xml:space="preserve"> After the ‘Send’ button is clicked, the day ends </w:t>
+      </w:r>
+      <w:r>
+        <w:t>and proceeds to the next</w:t>
+      </w:r>
+      <w:r>
+        <w:t xml:space="preserve"> day.</w:t>
+      </w:r>
+    </w:p>
+    <w:p>
+      <w:r>
+        <w:rPr>
+          <w:noProof/>
+        </w:rPr>
+        <w:drawing>
+          <wp:inline distT="0" distB="0" distL="0" distR="0" wp14:anchorId="0CE5B72C" wp14:editId="1E6D6968">
+            <wp:extent cx="5731510" cy="3223895"/>
+            <wp:effectExtent l="0" t="0" r="2540" b="0"/>
+            <wp:docPr id="211871018" name="Picture 3"/>
+            <wp:cNvGraphicFramePr>
+              <a:graphicFrameLocks xmlns:a="http://schemas.openxmlformats.org/drawingml/2006/main" noChangeAspect="1"/>
+            </wp:cNvGraphicFramePr>
+            <a:graphic xmlns:a="http://schemas.openxmlformats.org/drawingml/2006/main">
+              <a:graphicData uri="http://schemas.openxmlformats.org/drawingml/2006/picture">
+                <pic:pic xmlns:pic="http://schemas.openxmlformats.org/drawingml/2006/picture">
+                  <pic:nvPicPr>
+                    <pic:cNvPr id="211871018" name="Picture 211871018"/>
+                    <pic:cNvPicPr/>
+                  </pic:nvPicPr>
+                  <pic:blipFill>
+                    <a:blip r:embed="rId17" cstate="print">
+                      <a:extLst>
+                        <a:ext uri="{28A0092B-C50C-407E-A947-70E740481C1C}">
+                          <a14:useLocalDpi xmlns:a14="http://schemas.microsoft.com/office/drawing/2010/main" val="0"/>
+                        </a:ext>
+                      </a:extLst>
+                    </a:blip>
+                    <a:stretch>
+                      <a:fillRect/>
+                    </a:stretch>
+                  </pic:blipFill>
+                  <pic:spPr>
+                    <a:xfrm>
+                      <a:off x="0" y="0"/>
+                      <a:ext cx="5731510" cy="3223895"/>
+                    </a:xfrm>
+                    <a:prstGeom prst="rect">
+                      <a:avLst/>
+                    </a:prstGeom>
+                  </pic:spPr>
+                </pic:pic>
+              </a:graphicData>
+            </a:graphic>
+          </wp:inline>
+        </w:drawing>
+      </w:r>
+    </w:p>
+    <w:p>
+      <w:pPr>
+        <w:pStyle w:val="ImageCaptions"/>
+      </w:pPr>
+      <w:r>
         <w:t xml:space="preserve">Figure 7.1.1.6.1: Screenshot of EmailClient with </w:t>
       </w:r>
       <w:r>
@@ -6918,33 +7007,8 @@
                 <w:sz w:val="20"/>
                 <w:szCs w:val="20"/>
               </w:rPr>
-              <w:t xml:space="preserve"> </w:t>
-            </w:r>
-            <w:proofErr w:type="gramStart"/>
-            <w:r>
-              <w:rPr>
-                <w:sz w:val="20"/>
-                <w:szCs w:val="20"/>
-              </w:rPr>
-              <w:t>{ INBOUND</w:t>
-            </w:r>
-            <w:proofErr w:type="gramEnd"/>
-            <w:r>
-              <w:rPr>
-                <w:sz w:val="20"/>
-                <w:szCs w:val="20"/>
-              </w:rPr>
-              <w:t xml:space="preserve">, INVENTORY, OUTBOUND, </w:t>
-            </w:r>
-            <w:proofErr w:type="gramStart"/>
-            <w:r>
-              <w:rPr>
-                <w:sz w:val="20"/>
-                <w:szCs w:val="20"/>
-              </w:rPr>
-              <w:t>TRASH }</w:t>
-            </w:r>
-            <w:proofErr w:type="gramEnd"/>
+              <w:t xml:space="preserve"> { INBOUND, INVENTORY, OUTBOUND, TRASH }</w:t>
+            </w:r>
           </w:p>
           <w:p>
             <w:pPr>
@@ -6984,33 +7048,8 @@
                 <w:sz w:val="20"/>
                 <w:szCs w:val="20"/>
               </w:rPr>
-              <w:t xml:space="preserve"> </w:t>
-            </w:r>
-            <w:proofErr w:type="gramStart"/>
-            <w:r>
-              <w:rPr>
-                <w:sz w:val="20"/>
-                <w:szCs w:val="20"/>
-              </w:rPr>
-              <w:t>{ LEGIT</w:t>
-            </w:r>
-            <w:proofErr w:type="gramEnd"/>
-            <w:r>
-              <w:rPr>
-                <w:sz w:val="20"/>
-                <w:szCs w:val="20"/>
-              </w:rPr>
-              <w:t xml:space="preserve">, MALWARE, ADWARE, </w:t>
-            </w:r>
-            <w:proofErr w:type="gramStart"/>
-            <w:r>
-              <w:rPr>
-                <w:sz w:val="20"/>
-                <w:szCs w:val="20"/>
-              </w:rPr>
-              <w:t>RANSOMWARE }</w:t>
-            </w:r>
-            <w:proofErr w:type="gramEnd"/>
+              <w:t xml:space="preserve"> { LEGIT, MALWARE, ADWARE, RANSOMWARE }</w:t>
+            </w:r>
           </w:p>
           <w:p>
             <w:pPr>
@@ -7318,15 +7357,7 @@
                 <w:sz w:val="20"/>
                 <w:szCs w:val="20"/>
               </w:rPr>
-              <w:t>get_save_</w:t>
-            </w:r>
-            <w:proofErr w:type="gramStart"/>
-            <w:r>
-              <w:rPr>
-                <w:sz w:val="20"/>
-                <w:szCs w:val="20"/>
-              </w:rPr>
-              <w:t>data</w:t>
+              <w:t>get_save_data</w:t>
             </w:r>
             <w:proofErr w:type="spellEnd"/>
             <w:r>
@@ -7334,15 +7365,7 @@
                 <w:sz w:val="20"/>
                 <w:szCs w:val="20"/>
               </w:rPr>
-              <w:t>(</w:t>
-            </w:r>
-            <w:proofErr w:type="gramEnd"/>
-            <w:r>
-              <w:rPr>
-                <w:sz w:val="20"/>
-                <w:szCs w:val="20"/>
-              </w:rPr>
-              <w:t>) -&gt; String:</w:t>
+              <w:t>() -&gt; String:</w:t>
             </w:r>
           </w:p>
           <w:p>
@@ -7402,7 +7425,7 @@
                           <pic:cNvPicPr/>
                         </pic:nvPicPr>
                         <pic:blipFill>
-                          <a:blip r:embed="rId16">
+                          <a:blip r:embed="rId18">
                             <a:extLst>
                               <a:ext uri="{28A0092B-C50C-407E-A947-70E740481C1C}">
                                 <a14:useLocalDpi xmlns:a14="http://schemas.microsoft.com/office/drawing/2010/main" val="0"/>
@@ -7556,15 +7579,7 @@
                 <w:sz w:val="20"/>
                 <w:szCs w:val="20"/>
               </w:rPr>
-              <w:t>outbound_</w:t>
-            </w:r>
-            <w:proofErr w:type="gramStart"/>
-            <w:r>
-              <w:rPr>
-                <w:sz w:val="20"/>
-                <w:szCs w:val="20"/>
-              </w:rPr>
-              <w:t>updated</w:t>
+              <w:t>outbound_updated</w:t>
             </w:r>
             <w:proofErr w:type="spellEnd"/>
             <w:r>
@@ -7575,7 +7590,6 @@
               <w:t>(</w:t>
             </w:r>
             <w:proofErr w:type="spellStart"/>
-            <w:proofErr w:type="gramEnd"/>
             <w:r>
               <w:rPr>
                 <w:sz w:val="20"/>
@@ -7589,23 +7603,7 @@
                 <w:sz w:val="20"/>
                 <w:szCs w:val="20"/>
               </w:rPr>
-              <w:t xml:space="preserve">: </w:t>
-            </w:r>
-            <w:proofErr w:type="gramStart"/>
-            <w:r>
-              <w:rPr>
-                <w:sz w:val="20"/>
-                <w:szCs w:val="20"/>
-              </w:rPr>
-              <w:t>Array[</w:t>
-            </w:r>
-            <w:proofErr w:type="gramEnd"/>
-            <w:r>
-              <w:rPr>
-                <w:sz w:val="20"/>
-                <w:szCs w:val="20"/>
-              </w:rPr>
-              <w:t>FileData])</w:t>
+              <w:t>: Array[FileData])</w:t>
             </w:r>
           </w:p>
           <w:p>
@@ -7655,33 +7653,8 @@
                 <w:sz w:val="20"/>
                 <w:szCs w:val="20"/>
               </w:rPr>
-              <w:t xml:space="preserve"> </w:t>
-            </w:r>
-            <w:proofErr w:type="gramStart"/>
-            <w:r>
-              <w:rPr>
-                <w:sz w:val="20"/>
-                <w:szCs w:val="20"/>
-              </w:rPr>
-              <w:t>{ MESSAGE</w:t>
-            </w:r>
-            <w:proofErr w:type="gramEnd"/>
-            <w:r>
-              <w:rPr>
-                <w:sz w:val="20"/>
-                <w:szCs w:val="20"/>
-              </w:rPr>
-              <w:t xml:space="preserve">, INBOUND, </w:t>
-            </w:r>
-            <w:proofErr w:type="gramStart"/>
-            <w:r>
-              <w:rPr>
-                <w:sz w:val="20"/>
-                <w:szCs w:val="20"/>
-              </w:rPr>
-              <w:t>OUTBOUND }</w:t>
-            </w:r>
-            <w:proofErr w:type="gramEnd"/>
+              <w:t xml:space="preserve"> { MESSAGE, INBOUND, OUTBOUND }</w:t>
+            </w:r>
           </w:p>
           <w:p>
             <w:pPr>
@@ -7995,23 +7968,7 @@
                 <w:sz w:val="20"/>
                 <w:szCs w:val="20"/>
               </w:rPr>
-              <w:t xml:space="preserve">: </w:t>
-            </w:r>
-            <w:proofErr w:type="gramStart"/>
-            <w:r>
-              <w:rPr>
-                <w:sz w:val="20"/>
-                <w:szCs w:val="20"/>
-              </w:rPr>
-              <w:t>Array[</w:t>
-            </w:r>
-            <w:proofErr w:type="gramEnd"/>
-            <w:r>
-              <w:rPr>
-                <w:sz w:val="20"/>
-                <w:szCs w:val="20"/>
-              </w:rPr>
-              <w:t>FileData] = []</w:t>
+              <w:t>: Array[FileData] = []</w:t>
             </w:r>
           </w:p>
           <w:p>
@@ -8043,23 +8000,7 @@
                 <w:sz w:val="20"/>
                 <w:szCs w:val="20"/>
               </w:rPr>
-              <w:t xml:space="preserve">: </w:t>
-            </w:r>
-            <w:proofErr w:type="gramStart"/>
-            <w:r>
-              <w:rPr>
-                <w:sz w:val="20"/>
-                <w:szCs w:val="20"/>
-              </w:rPr>
-              <w:t>Array[</w:t>
-            </w:r>
-            <w:proofErr w:type="gramEnd"/>
-            <w:r>
-              <w:rPr>
-                <w:sz w:val="20"/>
-                <w:szCs w:val="20"/>
-              </w:rPr>
-              <w:t>FileData] = []</w:t>
+              <w:t>: Array[FileData] = []</w:t>
             </w:r>
           </w:p>
           <w:p>
@@ -8091,23 +8032,7 @@
                 <w:sz w:val="20"/>
                 <w:szCs w:val="20"/>
               </w:rPr>
-              <w:t xml:space="preserve">: </w:t>
-            </w:r>
-            <w:proofErr w:type="gramStart"/>
-            <w:r>
-              <w:rPr>
-                <w:sz w:val="20"/>
-                <w:szCs w:val="20"/>
-              </w:rPr>
-              <w:t>Array[</w:t>
-            </w:r>
-            <w:proofErr w:type="gramEnd"/>
-            <w:r>
-              <w:rPr>
-                <w:sz w:val="20"/>
-                <w:szCs w:val="20"/>
-              </w:rPr>
-              <w:t>FileData] = []</w:t>
+              <w:t>: Array[FileData] = []</w:t>
             </w:r>
           </w:p>
           <w:p>
@@ -8230,23 +8155,7 @@
                 <w:sz w:val="20"/>
                 <w:szCs w:val="20"/>
               </w:rPr>
-              <w:t xml:space="preserve">var </w:t>
-            </w:r>
-            <w:proofErr w:type="gramStart"/>
-            <w:r>
-              <w:rPr>
-                <w:sz w:val="20"/>
-                <w:szCs w:val="20"/>
-              </w:rPr>
-              <w:t>flags :</w:t>
-            </w:r>
-            <w:proofErr w:type="gramEnd"/>
-            <w:r>
-              <w:rPr>
-                <w:sz w:val="20"/>
-                <w:szCs w:val="20"/>
-              </w:rPr>
-              <w:t>= {</w:t>
+              <w:t>var flags := {</w:t>
             </w:r>
           </w:p>
           <w:p>
@@ -8364,15 +8273,7 @@
                 <w:sz w:val="20"/>
                 <w:szCs w:val="20"/>
               </w:rPr>
-              <w:t>get_</w:t>
-            </w:r>
-            <w:proofErr w:type="gramStart"/>
-            <w:r>
-              <w:rPr>
-                <w:sz w:val="20"/>
-                <w:szCs w:val="20"/>
-              </w:rPr>
-              <w:t>outbound</w:t>
+              <w:t>get_outbound</w:t>
             </w:r>
             <w:proofErr w:type="spellEnd"/>
             <w:r>
@@ -8380,31 +8281,7 @@
                 <w:sz w:val="20"/>
                 <w:szCs w:val="20"/>
               </w:rPr>
-              <w:t>(</w:t>
-            </w:r>
-            <w:proofErr w:type="gramEnd"/>
-            <w:r>
-              <w:rPr>
-                <w:sz w:val="20"/>
-                <w:szCs w:val="20"/>
-              </w:rPr>
-              <w:t xml:space="preserve">) -&gt; </w:t>
-            </w:r>
-            <w:proofErr w:type="gramStart"/>
-            <w:r>
-              <w:rPr>
-                <w:sz w:val="20"/>
-                <w:szCs w:val="20"/>
-              </w:rPr>
-              <w:t>Array[</w:t>
-            </w:r>
-            <w:proofErr w:type="gramEnd"/>
-            <w:r>
-              <w:rPr>
-                <w:sz w:val="20"/>
-                <w:szCs w:val="20"/>
-              </w:rPr>
-              <w:t>FileData]:</w:t>
+              <w:t>() -&gt; Array[FileData]:</w:t>
             </w:r>
           </w:p>
           <w:p>
@@ -8481,15 +8358,7 @@
                 <w:sz w:val="20"/>
                 <w:szCs w:val="20"/>
               </w:rPr>
-              <w:t>append_file_to_</w:t>
-            </w:r>
-            <w:proofErr w:type="gramStart"/>
-            <w:r>
-              <w:rPr>
-                <w:sz w:val="20"/>
-                <w:szCs w:val="20"/>
-              </w:rPr>
-              <w:t>outbound</w:t>
+              <w:t>append_file_to_outbound</w:t>
             </w:r>
             <w:proofErr w:type="spellEnd"/>
             <w:r>
@@ -8500,7 +8369,6 @@
               <w:t>(</w:t>
             </w:r>
             <w:proofErr w:type="spellStart"/>
-            <w:proofErr w:type="gramEnd"/>
             <w:r>
               <w:rPr>
                 <w:sz w:val="20"/>
@@ -8538,18 +8406,9 @@
                 <w:sz w:val="20"/>
                 <w:szCs w:val="20"/>
               </w:rPr>
-              <w:t>outbound_</w:t>
-            </w:r>
-            <w:proofErr w:type="gramStart"/>
-            <w:r>
-              <w:rPr>
-                <w:sz w:val="20"/>
-                <w:szCs w:val="20"/>
-              </w:rPr>
-              <w:t>attachments.append</w:t>
+              <w:t>outbound_attachments.append</w:t>
             </w:r>
             <w:proofErr w:type="spellEnd"/>
-            <w:proofErr w:type="gramEnd"/>
             <w:r>
               <w:rPr>
                 <w:sz w:val="20"/>
@@ -8595,18 +8454,9 @@
                 <w:sz w:val="20"/>
                 <w:szCs w:val="20"/>
               </w:rPr>
-              <w:t>outbound_</w:t>
-            </w:r>
-            <w:proofErr w:type="gramStart"/>
-            <w:r>
-              <w:rPr>
-                <w:sz w:val="20"/>
-                <w:szCs w:val="20"/>
-              </w:rPr>
-              <w:t>updated.emit</w:t>
+              <w:t>outbound_updated.emit</w:t>
             </w:r>
             <w:proofErr w:type="spellEnd"/>
-            <w:proofErr w:type="gramEnd"/>
             <w:r>
               <w:rPr>
                 <w:sz w:val="20"/>
@@ -8620,18 +8470,9 @@
                 <w:sz w:val="20"/>
                 <w:szCs w:val="20"/>
               </w:rPr>
-              <w:t>outbound_</w:t>
-            </w:r>
-            <w:proofErr w:type="gramStart"/>
-            <w:r>
-              <w:rPr>
-                <w:sz w:val="20"/>
-                <w:szCs w:val="20"/>
-              </w:rPr>
-              <w:t>attachments.duplicate</w:t>
+              <w:t>outbound_attachments.duplicate</w:t>
             </w:r>
             <w:proofErr w:type="spellEnd"/>
-            <w:proofErr w:type="gramEnd"/>
             <w:r>
               <w:rPr>
                 <w:sz w:val="20"/>
@@ -8688,15 +8529,7 @@
                 <w:sz w:val="20"/>
                 <w:szCs w:val="20"/>
               </w:rPr>
-              <w:t>remove_file_from_</w:t>
-            </w:r>
-            <w:proofErr w:type="gramStart"/>
-            <w:r>
-              <w:rPr>
-                <w:sz w:val="20"/>
-                <w:szCs w:val="20"/>
-              </w:rPr>
-              <w:t>outbound</w:t>
+              <w:t>remove_file_from_outbound</w:t>
             </w:r>
             <w:proofErr w:type="spellEnd"/>
             <w:r>
@@ -8707,7 +8540,6 @@
               <w:t>(</w:t>
             </w:r>
             <w:proofErr w:type="spellStart"/>
-            <w:proofErr w:type="gramEnd"/>
             <w:r>
               <w:rPr>
                 <w:sz w:val="20"/>
@@ -8745,18 +8577,9 @@
                 <w:sz w:val="20"/>
                 <w:szCs w:val="20"/>
               </w:rPr>
-              <w:t>outbound_</w:t>
-            </w:r>
-            <w:proofErr w:type="gramStart"/>
-            <w:r>
-              <w:rPr>
-                <w:sz w:val="20"/>
-                <w:szCs w:val="20"/>
-              </w:rPr>
-              <w:t>attachments.erase</w:t>
+              <w:t>outbound_attachments.erase</w:t>
             </w:r>
             <w:proofErr w:type="spellEnd"/>
-            <w:proofErr w:type="gramEnd"/>
             <w:r>
               <w:rPr>
                 <w:sz w:val="20"/>
@@ -8802,18 +8625,9 @@
                 <w:sz w:val="20"/>
                 <w:szCs w:val="20"/>
               </w:rPr>
-              <w:t>outbound_</w:t>
-            </w:r>
-            <w:proofErr w:type="gramStart"/>
-            <w:r>
-              <w:rPr>
-                <w:sz w:val="20"/>
-                <w:szCs w:val="20"/>
-              </w:rPr>
-              <w:t>updated.emit</w:t>
+              <w:t>outbound_updated.emit</w:t>
             </w:r>
             <w:proofErr w:type="spellEnd"/>
-            <w:proofErr w:type="gramEnd"/>
             <w:r>
               <w:rPr>
                 <w:sz w:val="20"/>
@@ -8827,18 +8641,9 @@
                 <w:sz w:val="20"/>
                 <w:szCs w:val="20"/>
               </w:rPr>
-              <w:t>outbound_</w:t>
-            </w:r>
-            <w:proofErr w:type="gramStart"/>
-            <w:r>
-              <w:rPr>
-                <w:sz w:val="20"/>
-                <w:szCs w:val="20"/>
-              </w:rPr>
-              <w:t>attachments.duplicate</w:t>
+              <w:t>outbound_attachments.duplicate</w:t>
             </w:r>
             <w:proofErr w:type="spellEnd"/>
-            <w:proofErr w:type="gramEnd"/>
             <w:r>
               <w:rPr>
                 <w:sz w:val="20"/>
@@ -8895,15 +8700,7 @@
                 <w:sz w:val="20"/>
                 <w:szCs w:val="20"/>
               </w:rPr>
-              <w:t>get_save_</w:t>
-            </w:r>
-            <w:proofErr w:type="gramStart"/>
-            <w:r>
-              <w:rPr>
-                <w:sz w:val="20"/>
-                <w:szCs w:val="20"/>
-              </w:rPr>
-              <w:t>data</w:t>
+              <w:t>get_save_data</w:t>
             </w:r>
             <w:proofErr w:type="spellEnd"/>
             <w:r>
@@ -8911,15 +8708,7 @@
                 <w:sz w:val="20"/>
                 <w:szCs w:val="20"/>
               </w:rPr>
-              <w:t>(</w:t>
-            </w:r>
-            <w:proofErr w:type="gramEnd"/>
-            <w:r>
-              <w:rPr>
-                <w:sz w:val="20"/>
-                <w:szCs w:val="20"/>
-              </w:rPr>
-              <w:t>) -&gt; Dictionary:</w:t>
+              <w:t>() -&gt; Dictionary:</w:t>
             </w:r>
           </w:p>
           <w:p>
@@ -8945,15 +8734,7 @@
                 <w:sz w:val="20"/>
                 <w:szCs w:val="20"/>
               </w:rPr>
-              <w:t>outbound_</w:t>
-            </w:r>
-            <w:proofErr w:type="gramStart"/>
-            <w:r>
-              <w:rPr>
-                <w:sz w:val="20"/>
-                <w:szCs w:val="20"/>
-              </w:rPr>
-              <w:t>ids</w:t>
+              <w:t>outbound_ids</w:t>
             </w:r>
             <w:proofErr w:type="spellEnd"/>
             <w:r>
@@ -8961,15 +8742,7 @@
                 <w:sz w:val="20"/>
                 <w:szCs w:val="20"/>
               </w:rPr>
-              <w:t xml:space="preserve"> :</w:t>
-            </w:r>
-            <w:proofErr w:type="gramEnd"/>
-            <w:r>
-              <w:rPr>
-                <w:sz w:val="20"/>
-                <w:szCs w:val="20"/>
-              </w:rPr>
-              <w:t>= []</w:t>
+              <w:t xml:space="preserve"> := []</w:t>
             </w:r>
           </w:p>
           <w:p>
@@ -9049,18 +8822,9 @@
                 <w:sz w:val="20"/>
                 <w:szCs w:val="20"/>
               </w:rPr>
-              <w:t>outbound_</w:t>
-            </w:r>
-            <w:proofErr w:type="gramStart"/>
-            <w:r>
-              <w:rPr>
-                <w:sz w:val="20"/>
-                <w:szCs w:val="20"/>
-              </w:rPr>
-              <w:t>ids.append</w:t>
+              <w:t>outbound_ids.append</w:t>
             </w:r>
             <w:proofErr w:type="spellEnd"/>
-            <w:proofErr w:type="gramEnd"/>
             <w:r>
               <w:rPr>
                 <w:sz w:val="20"/>
@@ -9074,15 +8838,7 @@
                 <w:sz w:val="20"/>
                 <w:szCs w:val="20"/>
               </w:rPr>
-              <w:t>file.get_save_</w:t>
-            </w:r>
-            <w:proofErr w:type="gramStart"/>
-            <w:r>
-              <w:rPr>
-                <w:sz w:val="20"/>
-                <w:szCs w:val="20"/>
-              </w:rPr>
-              <w:t>data</w:t>
+              <w:t>file.get_save_data</w:t>
             </w:r>
             <w:proofErr w:type="spellEnd"/>
             <w:r>
@@ -9090,15 +8846,7 @@
                 <w:sz w:val="20"/>
                 <w:szCs w:val="20"/>
               </w:rPr>
-              <w:t>(</w:t>
-            </w:r>
-            <w:proofErr w:type="gramEnd"/>
-            <w:r>
-              <w:rPr>
-                <w:sz w:val="20"/>
-                <w:szCs w:val="20"/>
-              </w:rPr>
-              <w:t>))</w:t>
+              <w:t>())</w:t>
             </w:r>
           </w:p>
           <w:p>
@@ -9222,21 +8970,12 @@
               <w:t>"</w:t>
             </w:r>
             <w:proofErr w:type="spellStart"/>
-            <w:proofErr w:type="gramStart"/>
-            <w:r>
-              <w:rPr>
-                <w:sz w:val="20"/>
-                <w:szCs w:val="20"/>
-              </w:rPr>
-              <w:t>outbound</w:t>
-            </w:r>
-            <w:proofErr w:type="gramEnd"/>
-            <w:r>
-              <w:rPr>
-                <w:sz w:val="20"/>
-                <w:szCs w:val="20"/>
-              </w:rPr>
-              <w:t>_files</w:t>
+            <w:r>
+              <w:rPr>
+                <w:sz w:val="20"/>
+                <w:szCs w:val="20"/>
+              </w:rPr>
+              <w:t>outbound_files</w:t>
             </w:r>
             <w:proofErr w:type="spellEnd"/>
             <w:r>
@@ -9297,7 +9036,7 @@
                           <pic:cNvPicPr/>
                         </pic:nvPicPr>
                         <pic:blipFill>
-                          <a:blip r:embed="rId17">
+                          <a:blip r:embed="rId19">
                             <a:extLst>
                               <a:ext uri="{28A0092B-C50C-407E-A947-70E740481C1C}">
                                 <a14:useLocalDpi xmlns:a14="http://schemas.microsoft.com/office/drawing/2010/main" val="0"/>
@@ -9514,23 +9253,7 @@
                 <w:sz w:val="20"/>
                 <w:szCs w:val="20"/>
               </w:rPr>
-              <w:t xml:space="preserve">@export var emails: </w:t>
-            </w:r>
-            <w:proofErr w:type="gramStart"/>
-            <w:r>
-              <w:rPr>
-                <w:sz w:val="20"/>
-                <w:szCs w:val="20"/>
-              </w:rPr>
-              <w:t>Array[</w:t>
-            </w:r>
-            <w:proofErr w:type="gramEnd"/>
-            <w:r>
-              <w:rPr>
-                <w:sz w:val="20"/>
-                <w:szCs w:val="20"/>
-              </w:rPr>
-              <w:t>EmailData] = []</w:t>
+              <w:t>@export var emails: Array[EmailData] = []</w:t>
             </w:r>
           </w:p>
           <w:p/>
@@ -9564,7 +9287,7 @@
                           <pic:cNvPicPr/>
                         </pic:nvPicPr>
                         <pic:blipFill>
-                          <a:blip r:embed="rId18">
+                          <a:blip r:embed="rId20">
                             <a:extLst>
                               <a:ext uri="{28A0092B-C50C-407E-A947-70E740481C1C}">
                                 <a14:useLocalDpi xmlns:a14="http://schemas.microsoft.com/office/drawing/2010/main" val="0"/>
@@ -9734,23 +9457,7 @@
                 <w:sz w:val="20"/>
                 <w:szCs w:val="20"/>
               </w:rPr>
-              <w:t xml:space="preserve"> start_new_</w:t>
-            </w:r>
-            <w:proofErr w:type="gramStart"/>
-            <w:r>
-              <w:rPr>
-                <w:sz w:val="20"/>
-                <w:szCs w:val="20"/>
-              </w:rPr>
-              <w:t>game(</w:t>
-            </w:r>
-            <w:proofErr w:type="gramEnd"/>
-            <w:r>
-              <w:rPr>
-                <w:sz w:val="20"/>
-                <w:szCs w:val="20"/>
-              </w:rPr>
-              <w:t>) -&gt; void:</w:t>
+              <w:t xml:space="preserve"> start_new_game() -&gt; void:</w:t>
             </w:r>
           </w:p>
           <w:p>
@@ -9866,15 +9573,7 @@
                 <w:sz w:val="20"/>
                 <w:szCs w:val="20"/>
               </w:rPr>
-              <w:t>EmailServiceInstance.append_latest_email_</w:t>
-            </w:r>
-            <w:proofErr w:type="gramStart"/>
-            <w:r>
-              <w:rPr>
-                <w:sz w:val="20"/>
-                <w:szCs w:val="20"/>
-              </w:rPr>
-              <w:t>data</w:t>
+              <w:t>EmailServiceInstance.append_latest_email_data</w:t>
             </w:r>
             <w:proofErr w:type="spellEnd"/>
             <w:r>
@@ -9882,15 +9581,7 @@
                 <w:sz w:val="20"/>
                 <w:szCs w:val="20"/>
               </w:rPr>
-              <w:t>(</w:t>
-            </w:r>
-            <w:proofErr w:type="gramEnd"/>
-            <w:r>
-              <w:rPr>
-                <w:sz w:val="20"/>
-                <w:szCs w:val="20"/>
-              </w:rPr>
-              <w:t>)</w:t>
+              <w:t>()</w:t>
             </w:r>
           </w:p>
           <w:p>
@@ -9913,15 +9604,7 @@
                 <w:sz w:val="20"/>
                 <w:szCs w:val="20"/>
               </w:rPr>
-              <w:t>SaveloadServiceInstance.save_</w:t>
-            </w:r>
-            <w:proofErr w:type="gramStart"/>
-            <w:r>
-              <w:rPr>
-                <w:sz w:val="20"/>
-                <w:szCs w:val="20"/>
-              </w:rPr>
-              <w:t>game</w:t>
+              <w:t>SaveloadServiceInstance.save_game</w:t>
             </w:r>
             <w:proofErr w:type="spellEnd"/>
             <w:r>
@@ -9929,15 +9612,7 @@
                 <w:sz w:val="20"/>
                 <w:szCs w:val="20"/>
               </w:rPr>
-              <w:t>(</w:t>
-            </w:r>
-            <w:proofErr w:type="gramEnd"/>
-            <w:r>
-              <w:rPr>
-                <w:sz w:val="20"/>
-                <w:szCs w:val="20"/>
-              </w:rPr>
-              <w:t>)</w:t>
+              <w:t>()</w:t>
             </w:r>
           </w:p>
           <w:p>
@@ -9956,15 +9631,7 @@
         <w:pStyle w:val="ImageCaptions"/>
       </w:pPr>
       <w:r>
-        <w:t>Figure 7.1.3.1: A start_new_</w:t>
-      </w:r>
-      <w:proofErr w:type="gramStart"/>
-      <w:r>
-        <w:t>game(</w:t>
-      </w:r>
-      <w:proofErr w:type="gramEnd"/>
-      <w:r>
-        <w:t>) function in GameManager.gd</w:t>
+        <w:t>Figure 7.1.3.1: A start_new_game() function in GameManager.gd</w:t>
       </w:r>
     </w:p>
     <w:p/>
@@ -10199,19 +9866,11 @@
       </w:r>
       <w:proofErr w:type="spellStart"/>
       <w:r>
-        <w:t>gather_data_for_</w:t>
-      </w:r>
-      <w:proofErr w:type="gramStart"/>
-      <w:r>
-        <w:t>save</w:t>
+        <w:t>gather_data_for_save</w:t>
       </w:r>
       <w:proofErr w:type="spellEnd"/>
       <w:r>
-        <w:t>(</w:t>
-      </w:r>
-      <w:proofErr w:type="gramEnd"/>
-      <w:r>
-        <w:t xml:space="preserve">) function from other autoloads. The compiled data is then serialised and stored </w:t>
+        <w:t xml:space="preserve">() function from other autoloads. The compiled data is then serialised and stored </w:t>
       </w:r>
       <w:r>
         <w:t>in JSON format in the user:// directory.</w:t>
@@ -10244,19 +9903,11 @@
             </w:r>
             <w:proofErr w:type="spellStart"/>
             <w:r>
-              <w:t>save_</w:t>
-            </w:r>
-            <w:proofErr w:type="gramStart"/>
-            <w:r>
-              <w:t>game</w:t>
+              <w:t>save_game</w:t>
             </w:r>
             <w:proofErr w:type="spellEnd"/>
             <w:r>
-              <w:t>(</w:t>
-            </w:r>
-            <w:proofErr w:type="gramEnd"/>
-            <w:r>
-              <w:t>) -&gt; void:</w:t>
+              <w:t>() -&gt; void:</w:t>
             </w:r>
           </w:p>
           <w:p>
@@ -10266,19 +9917,11 @@
             </w:r>
             <w:proofErr w:type="spellStart"/>
             <w:r>
-              <w:t>save_</w:t>
-            </w:r>
-            <w:proofErr w:type="gramStart"/>
-            <w:r>
-              <w:t>data</w:t>
+              <w:t>save_data</w:t>
             </w:r>
             <w:proofErr w:type="spellEnd"/>
             <w:r>
-              <w:t xml:space="preserve"> :</w:t>
-            </w:r>
-            <w:proofErr w:type="gramEnd"/>
-            <w:r>
-              <w:t>= {</w:t>
+              <w:t xml:space="preserve"> := {</w:t>
             </w:r>
           </w:p>
           <w:p>
@@ -10290,13 +9933,8 @@
               <w:t>"</w:t>
             </w:r>
             <w:proofErr w:type="spellStart"/>
-            <w:proofErr w:type="gramStart"/>
-            <w:r>
-              <w:t>player</w:t>
-            </w:r>
-            <w:proofErr w:type="gramEnd"/>
-            <w:r>
-              <w:t>_info</w:t>
+            <w:r>
+              <w:t>player_info</w:t>
             </w:r>
             <w:proofErr w:type="spellEnd"/>
             <w:r>
@@ -10304,19 +9942,11 @@
             </w:r>
             <w:proofErr w:type="spellStart"/>
             <w:r>
-              <w:t>GameManagerInstance.get_data_for_</w:t>
-            </w:r>
-            <w:proofErr w:type="gramStart"/>
-            <w:r>
-              <w:t>save</w:t>
+              <w:t>GameManagerInstance.get_data_for_save</w:t>
             </w:r>
             <w:proofErr w:type="spellEnd"/>
             <w:r>
-              <w:t>(</w:t>
-            </w:r>
-            <w:proofErr w:type="gramEnd"/>
-            <w:r>
-              <w:t>),</w:t>
+              <w:t>(),</w:t>
             </w:r>
           </w:p>
           <w:p>
@@ -10328,13 +9958,8 @@
               <w:t>"</w:t>
             </w:r>
             <w:proofErr w:type="spellStart"/>
-            <w:proofErr w:type="gramStart"/>
-            <w:r>
-              <w:t>level</w:t>
-            </w:r>
-            <w:proofErr w:type="gramEnd"/>
-            <w:r>
-              <w:t>_info</w:t>
+            <w:r>
+              <w:t>level_info</w:t>
             </w:r>
             <w:proofErr w:type="spellEnd"/>
             <w:r>
@@ -10342,19 +9967,11 @@
             </w:r>
             <w:proofErr w:type="spellStart"/>
             <w:r>
-              <w:t>LevelServiceInstance.get_data_for_</w:t>
-            </w:r>
-            <w:proofErr w:type="gramStart"/>
-            <w:r>
-              <w:t>save</w:t>
+              <w:t>LevelServiceInstance.get_data_for_save</w:t>
             </w:r>
             <w:proofErr w:type="spellEnd"/>
             <w:r>
-              <w:t>(</w:t>
-            </w:r>
-            <w:proofErr w:type="gramEnd"/>
-            <w:r>
-              <w:t>),</w:t>
+              <w:t>(),</w:t>
             </w:r>
           </w:p>
           <w:p>
@@ -10366,13 +9983,8 @@
               <w:t>"</w:t>
             </w:r>
             <w:proofErr w:type="spellStart"/>
-            <w:proofErr w:type="gramStart"/>
-            <w:r>
-              <w:t>player</w:t>
-            </w:r>
-            <w:proofErr w:type="gramEnd"/>
-            <w:r>
-              <w:t>_emails</w:t>
+            <w:r>
+              <w:t>player_emails</w:t>
             </w:r>
             <w:proofErr w:type="spellEnd"/>
             <w:r>
@@ -10380,19 +9992,11 @@
             </w:r>
             <w:proofErr w:type="spellStart"/>
             <w:r>
-              <w:t>EmailServiceInstance.get_data_for_</w:t>
-            </w:r>
-            <w:proofErr w:type="gramStart"/>
-            <w:r>
-              <w:t>save</w:t>
+              <w:t>EmailServiceInstance.get_data_for_save</w:t>
             </w:r>
             <w:proofErr w:type="spellEnd"/>
             <w:r>
-              <w:t>(</w:t>
-            </w:r>
-            <w:proofErr w:type="gramEnd"/>
-            <w:r>
-              <w:t>),</w:t>
+              <w:t>(),</w:t>
             </w:r>
           </w:p>
           <w:p>
@@ -10404,13 +10008,8 @@
               <w:t>"</w:t>
             </w:r>
             <w:proofErr w:type="spellStart"/>
-            <w:proofErr w:type="gramStart"/>
-            <w:r>
-              <w:t>player</w:t>
-            </w:r>
-            <w:proofErr w:type="gramEnd"/>
-            <w:r>
-              <w:t>_files</w:t>
+            <w:r>
+              <w:t>player_files</w:t>
             </w:r>
             <w:proofErr w:type="spellEnd"/>
             <w:r>
@@ -10418,19 +10017,11 @@
             </w:r>
             <w:proofErr w:type="spellStart"/>
             <w:r>
-              <w:t>FileServiceInstance.get_data_for_</w:t>
-            </w:r>
-            <w:proofErr w:type="gramStart"/>
-            <w:r>
-              <w:t>save</w:t>
+              <w:t>FileServiceInstance.get_data_for_save</w:t>
             </w:r>
             <w:proofErr w:type="spellEnd"/>
             <w:r>
-              <w:t>(</w:t>
-            </w:r>
-            <w:proofErr w:type="gramEnd"/>
-            <w:r>
-              <w:t>)</w:t>
+              <w:t>()</w:t>
             </w:r>
           </w:p>
           <w:p>
@@ -10479,24 +10070,14 @@
               <w:tab/>
             </w:r>
             <w:proofErr w:type="spellStart"/>
-            <w:proofErr w:type="gramStart"/>
-            <w:r>
-              <w:t>file.store</w:t>
-            </w:r>
-            <w:proofErr w:type="gramEnd"/>
-            <w:r>
-              <w:t>_</w:t>
-            </w:r>
-            <w:proofErr w:type="gramStart"/>
-            <w:r>
-              <w:t>string</w:t>
+            <w:r>
+              <w:t>file.store_string</w:t>
             </w:r>
             <w:proofErr w:type="spellEnd"/>
             <w:r>
               <w:t>(</w:t>
             </w:r>
             <w:proofErr w:type="spellStart"/>
-            <w:proofErr w:type="gramEnd"/>
             <w:r>
               <w:t>JSON.stringify</w:t>
             </w:r>
@@ -10518,12 +10099,10 @@
               <w:tab/>
             </w:r>
             <w:proofErr w:type="spellStart"/>
-            <w:proofErr w:type="gramStart"/>
             <w:r>
               <w:t>file.close</w:t>
             </w:r>
             <w:proofErr w:type="spellEnd"/>
-            <w:proofErr w:type="gramEnd"/>
             <w:r>
               <w:t>()</w:t>
             </w:r>
@@ -10541,19 +10120,11 @@
       </w:r>
       <w:proofErr w:type="spellStart"/>
       <w:r>
-        <w:t>save_</w:t>
-      </w:r>
-      <w:proofErr w:type="gramStart"/>
-      <w:r>
-        <w:t>game</w:t>
+        <w:t>save_game</w:t>
       </w:r>
       <w:proofErr w:type="spellEnd"/>
       <w:r>
-        <w:t>(</w:t>
-      </w:r>
-      <w:proofErr w:type="gramEnd"/>
-      <w:r>
-        <w:t>) source code from SaveLoadService.gd</w:t>
+        <w:t>() source code from SaveLoadService.gd</w:t>
       </w:r>
     </w:p>
     <w:p/>
@@ -10745,12 +10316,10 @@
               <w:t xml:space="preserve"> = new </w:t>
             </w:r>
             <w:proofErr w:type="spellStart"/>
-            <w:proofErr w:type="gramStart"/>
             <w:r>
               <w:t>mongoose.Schema</w:t>
             </w:r>
             <w:proofErr w:type="spellEnd"/>
-            <w:proofErr w:type="gramEnd"/>
             <w:r>
               <w:t>({</w:t>
             </w:r>
@@ -10824,12 +10393,10 @@
               <w:t xml:space="preserve"> Player = </w:t>
             </w:r>
             <w:proofErr w:type="spellStart"/>
-            <w:proofErr w:type="gramStart"/>
             <w:r>
               <w:t>mongoose.model</w:t>
             </w:r>
             <w:proofErr w:type="spellEnd"/>
-            <w:proofErr w:type="gramEnd"/>
             <w:r>
               <w:t xml:space="preserve">('Player', </w:t>
             </w:r>
@@ -10852,12 +10419,10 @@
           </w:p>
           <w:p>
             <w:proofErr w:type="spellStart"/>
-            <w:proofErr w:type="gramStart"/>
             <w:r>
               <w:t>module.exports</w:t>
             </w:r>
             <w:proofErr w:type="spellEnd"/>
-            <w:proofErr w:type="gramEnd"/>
             <w:r>
               <w:t xml:space="preserve"> = Player;</w:t>
             </w:r>
@@ -10925,20 +10490,152 @@
           <w:p/>
           <w:p>
             <w:proofErr w:type="spellStart"/>
-            <w:proofErr w:type="gramStart"/>
             <w:r>
               <w:t>app.get</w:t>
             </w:r>
             <w:proofErr w:type="spellEnd"/>
             <w:r>
+              <w:t>('/leaderboard', async (</w:t>
+            </w:r>
+            <w:proofErr w:type="spellStart"/>
+            <w:r>
+              <w:t>req</w:t>
+            </w:r>
+            <w:proofErr w:type="spellEnd"/>
+            <w:r>
+              <w:t>, res) =&gt; {</w:t>
+            </w:r>
+          </w:p>
+          <w:p>
+            <w:r>
+              <w:t>    try {</w:t>
+            </w:r>
+          </w:p>
+          <w:p>
+            <w:r>
+              <w:t xml:space="preserve">        </w:t>
+            </w:r>
+            <w:proofErr w:type="spellStart"/>
+            <w:r>
+              <w:t>const</w:t>
+            </w:r>
+            <w:proofErr w:type="spellEnd"/>
+            <w:r>
+              <w:t xml:space="preserve"> </w:t>
+            </w:r>
+            <w:proofErr w:type="spellStart"/>
+            <w:r>
+              <w:t>topPlayers</w:t>
+            </w:r>
+            <w:proofErr w:type="spellEnd"/>
+            <w:r>
+              <w:t xml:space="preserve"> = await </w:t>
+            </w:r>
+            <w:proofErr w:type="spellStart"/>
+            <w:r>
+              <w:t>Player.find</w:t>
+            </w:r>
+            <w:proofErr w:type="spellEnd"/>
+            <w:r>
+              <w:t>()</w:t>
+            </w:r>
+          </w:p>
+          <w:p>
+            <w:r>
+              <w:t>            .sort({ score : -1 })</w:t>
+            </w:r>
+          </w:p>
+          <w:p>
+            <w:r>
+              <w:t>            .limit(8);</w:t>
+            </w:r>
+          </w:p>
+          <w:p/>
+          <w:p>
+            <w:r>
+              <w:t xml:space="preserve">        </w:t>
+            </w:r>
+            <w:proofErr w:type="spellStart"/>
+            <w:r>
+              <w:t>res.json</w:t>
+            </w:r>
+            <w:proofErr w:type="spellEnd"/>
+            <w:r>
               <w:t>(</w:t>
             </w:r>
-            <w:proofErr w:type="gramEnd"/>
-            <w:r>
-              <w:t>'/leaderboard', async (</w:t>
-            </w:r>
             <w:proofErr w:type="spellStart"/>
             <w:r>
+              <w:t>topPlayers</w:t>
+            </w:r>
+            <w:proofErr w:type="spellEnd"/>
+            <w:r>
+              <w:t>);</w:t>
+            </w:r>
+          </w:p>
+          <w:p>
+            <w:r>
+              <w:t>    } catch (error) {</w:t>
+            </w:r>
+          </w:p>
+          <w:p>
+            <w:r>
+              <w:t xml:space="preserve">        </w:t>
+            </w:r>
+            <w:proofErr w:type="spellStart"/>
+            <w:r>
+              <w:t>res.status</w:t>
+            </w:r>
+            <w:proofErr w:type="spellEnd"/>
+            <w:r>
+              <w:t>(500).</w:t>
+            </w:r>
+            <w:proofErr w:type="spellStart"/>
+            <w:r>
+              <w:t>json</w:t>
+            </w:r>
+            <w:proofErr w:type="spellEnd"/>
+            <w:r>
+              <w:t xml:space="preserve">({ message: </w:t>
+            </w:r>
+            <w:proofErr w:type="spellStart"/>
+            <w:r>
+              <w:t>error.message</w:t>
+            </w:r>
+            <w:proofErr w:type="spellEnd"/>
+            <w:r>
+              <w:t xml:space="preserve"> });</w:t>
+            </w:r>
+          </w:p>
+          <w:p>
+            <w:r>
+              <w:t>    }</w:t>
+            </w:r>
+          </w:p>
+          <w:p>
+            <w:r>
+              <w:t>});</w:t>
+            </w:r>
+          </w:p>
+          <w:p/>
+          <w:p>
+            <w:proofErr w:type="spellStart"/>
+            <w:r>
+              <w:t>app.post</w:t>
+            </w:r>
+            <w:proofErr w:type="spellEnd"/>
+            <w:r>
+              <w:t>('/</w:t>
+            </w:r>
+            <w:proofErr w:type="spellStart"/>
+            <w:r>
+              <w:t>submitPlayerInfo</w:t>
+            </w:r>
+            <w:proofErr w:type="spellEnd"/>
+            <w:r>
+              <w:t>', async (</w:t>
+            </w:r>
+            <w:proofErr w:type="spellStart"/>
+            <w:r>
               <w:t>req</w:t>
             </w:r>
             <w:proofErr w:type="spellEnd"/>
@@ -10948,6 +10645,33 @@
           </w:p>
           <w:p>
             <w:r>
+              <w:t xml:space="preserve">    </w:t>
+            </w:r>
+            <w:proofErr w:type="spellStart"/>
+            <w:r>
+              <w:t>const</w:t>
+            </w:r>
+            <w:proofErr w:type="spellEnd"/>
+            <w:r>
+              <w:t xml:space="preserve"> { </w:t>
+            </w:r>
+            <w:proofErr w:type="spellStart"/>
+            <w:r>
+              <w:t>player_name</w:t>
+            </w:r>
+            <w:proofErr w:type="spellEnd"/>
+            <w:r>
+              <w:t xml:space="preserve">, score } = </w:t>
+            </w:r>
+            <w:proofErr w:type="spellStart"/>
+            <w:r>
+              <w:t>req.body</w:t>
+            </w:r>
+            <w:proofErr w:type="spellEnd"/>
+          </w:p>
+          <w:p/>
+          <w:p>
+            <w:r>
               <w:t>    try {</w:t>
             </w:r>
           </w:p>
@@ -10965,7 +10689,7 @@
             </w:r>
             <w:proofErr w:type="spellStart"/>
             <w:r>
-              <w:t>topPlayers</w:t>
+              <w:t>createdPlayer</w:t>
             </w:r>
             <w:proofErr w:type="spellEnd"/>
             <w:r>
@@ -10973,45 +10697,42 @@
             </w:r>
             <w:proofErr w:type="spellStart"/>
             <w:r>
-              <w:t>Player.find</w:t>
+              <w:t>Player.create</w:t>
             </w:r>
             <w:proofErr w:type="spellEnd"/>
             <w:r>
-              <w:t>()</w:t>
+              <w:t>({</w:t>
             </w:r>
           </w:p>
           <w:p>
             <w:r>
               <w:t xml:space="preserve">            </w:t>
             </w:r>
-            <w:proofErr w:type="gramStart"/>
-            <w:r>
-              <w:t>.sort({ score</w:t>
-            </w:r>
-            <w:proofErr w:type="gramEnd"/>
-            <w:r>
-              <w:t xml:space="preserve"> : -</w:t>
-            </w:r>
-            <w:proofErr w:type="gramStart"/>
-            <w:r>
-              <w:t>1 }</w:t>
-            </w:r>
-            <w:proofErr w:type="gramEnd"/>
-            <w:r>
-              <w:t>)</w:t>
-            </w:r>
-          </w:p>
-          <w:p>
-            <w:r>
-              <w:t xml:space="preserve">            </w:t>
-            </w:r>
-            <w:proofErr w:type="gramStart"/>
-            <w:r>
-              <w:t>.limit</w:t>
-            </w:r>
-            <w:proofErr w:type="gramEnd"/>
-            <w:r>
-              <w:t>(8);</w:t>
+            <w:proofErr w:type="spellStart"/>
+            <w:r>
+              <w:t>player_name</w:t>
+            </w:r>
+            <w:proofErr w:type="spellEnd"/>
+            <w:r>
+              <w:t xml:space="preserve">: </w:t>
+            </w:r>
+            <w:proofErr w:type="spellStart"/>
+            <w:r>
+              <w:t>player_name</w:t>
+            </w:r>
+            <w:proofErr w:type="spellEnd"/>
+            <w:r>
+              <w:t>,</w:t>
+            </w:r>
+          </w:p>
+          <w:p>
+            <w:r>
+              <w:t>            score: score</w:t>
+            </w:r>
+          </w:p>
+          <w:p>
+            <w:r>
+              <w:t>        })</w:t>
             </w:r>
           </w:p>
           <w:p/>
@@ -11020,24 +10741,31 @@
               <w:t xml:space="preserve">        </w:t>
             </w:r>
             <w:proofErr w:type="spellStart"/>
-            <w:proofErr w:type="gramStart"/>
-            <w:r>
-              <w:t>res.json</w:t>
+            <w:r>
+              <w:t>res.status</w:t>
             </w:r>
             <w:proofErr w:type="spellEnd"/>
-            <w:proofErr w:type="gramEnd"/>
+            <w:r>
+              <w:t>(201).</w:t>
+            </w:r>
+            <w:proofErr w:type="spellStart"/>
+            <w:r>
+              <w:t>json</w:t>
+            </w:r>
+            <w:proofErr w:type="spellEnd"/>
             <w:r>
               <w:t>(</w:t>
             </w:r>
             <w:proofErr w:type="spellStart"/>
             <w:r>
-              <w:t>topPlayers</w:t>
+              <w:t>createdPlayer</w:t>
             </w:r>
             <w:proofErr w:type="spellEnd"/>
             <w:r>
               <w:t>);</w:t>
             </w:r>
           </w:p>
+          <w:p/>
           <w:p>
             <w:r>
               <w:t>    } catch (error) {</w:t>
@@ -11048,18 +10776,12 @@
               <w:t xml:space="preserve">        </w:t>
             </w:r>
             <w:proofErr w:type="spellStart"/>
-            <w:proofErr w:type="gramStart"/>
             <w:r>
               <w:t>res.status</w:t>
             </w:r>
             <w:proofErr w:type="spellEnd"/>
-            <w:proofErr w:type="gramEnd"/>
-            <w:r>
-              <w:t>(500</w:t>
-            </w:r>
-            <w:proofErr w:type="gramStart"/>
-            <w:r>
-              <w:t>).</w:t>
+            <w:r>
+              <w:t>(500).</w:t>
             </w:r>
             <w:proofErr w:type="spellStart"/>
             <w:r>
@@ -11067,255 +10789,13 @@
             </w:r>
             <w:proofErr w:type="spellEnd"/>
             <w:r>
-              <w:t>({ message</w:t>
-            </w:r>
-            <w:proofErr w:type="gramEnd"/>
-            <w:r>
-              <w:t xml:space="preserve">: </w:t>
+              <w:t xml:space="preserve">({ message: </w:t>
             </w:r>
             <w:proofErr w:type="spellStart"/>
-            <w:proofErr w:type="gramStart"/>
             <w:r>
               <w:t>error.message</w:t>
             </w:r>
             <w:proofErr w:type="spellEnd"/>
-            <w:proofErr w:type="gramEnd"/>
-            <w:r>
-              <w:t xml:space="preserve"> });</w:t>
-            </w:r>
-          </w:p>
-          <w:p>
-            <w:r>
-              <w:t>    }</w:t>
-            </w:r>
-          </w:p>
-          <w:p>
-            <w:r>
-              <w:t>});</w:t>
-            </w:r>
-          </w:p>
-          <w:p/>
-          <w:p>
-            <w:proofErr w:type="spellStart"/>
-            <w:proofErr w:type="gramStart"/>
-            <w:r>
-              <w:t>app.post</w:t>
-            </w:r>
-            <w:proofErr w:type="spellEnd"/>
-            <w:r>
-              <w:t>(</w:t>
-            </w:r>
-            <w:proofErr w:type="gramEnd"/>
-            <w:r>
-              <w:t>'/</w:t>
-            </w:r>
-            <w:proofErr w:type="spellStart"/>
-            <w:r>
-              <w:t>submitPlayerInfo</w:t>
-            </w:r>
-            <w:proofErr w:type="spellEnd"/>
-            <w:r>
-              <w:t>', async (</w:t>
-            </w:r>
-            <w:proofErr w:type="spellStart"/>
-            <w:r>
-              <w:t>req</w:t>
-            </w:r>
-            <w:proofErr w:type="spellEnd"/>
-            <w:r>
-              <w:t>, res) =&gt; {</w:t>
-            </w:r>
-          </w:p>
-          <w:p>
-            <w:r>
-              <w:t xml:space="preserve">    </w:t>
-            </w:r>
-            <w:proofErr w:type="spellStart"/>
-            <w:r>
-              <w:t>const</w:t>
-            </w:r>
-            <w:proofErr w:type="spellEnd"/>
-            <w:r>
-              <w:t xml:space="preserve"> </w:t>
-            </w:r>
-            <w:proofErr w:type="gramStart"/>
-            <w:r>
-              <w:t xml:space="preserve">{ </w:t>
-            </w:r>
-            <w:proofErr w:type="spellStart"/>
-            <w:r>
-              <w:t>player</w:t>
-            </w:r>
-            <w:proofErr w:type="gramEnd"/>
-            <w:r>
-              <w:t>_name</w:t>
-            </w:r>
-            <w:proofErr w:type="spellEnd"/>
-            <w:r>
-              <w:t xml:space="preserve">, </w:t>
-            </w:r>
-            <w:proofErr w:type="gramStart"/>
-            <w:r>
-              <w:t>score }</w:t>
-            </w:r>
-            <w:proofErr w:type="gramEnd"/>
-            <w:r>
-              <w:t xml:space="preserve"> = </w:t>
-            </w:r>
-            <w:proofErr w:type="spellStart"/>
-            <w:proofErr w:type="gramStart"/>
-            <w:r>
-              <w:t>req.body</w:t>
-            </w:r>
-            <w:proofErr w:type="spellEnd"/>
-            <w:proofErr w:type="gramEnd"/>
-          </w:p>
-          <w:p/>
-          <w:p>
-            <w:r>
-              <w:t>    try {</w:t>
-            </w:r>
-          </w:p>
-          <w:p>
-            <w:r>
-              <w:t xml:space="preserve">        </w:t>
-            </w:r>
-            <w:proofErr w:type="spellStart"/>
-            <w:r>
-              <w:t>const</w:t>
-            </w:r>
-            <w:proofErr w:type="spellEnd"/>
-            <w:r>
-              <w:t xml:space="preserve"> </w:t>
-            </w:r>
-            <w:proofErr w:type="spellStart"/>
-            <w:r>
-              <w:t>createdPlayer</w:t>
-            </w:r>
-            <w:proofErr w:type="spellEnd"/>
-            <w:r>
-              <w:t xml:space="preserve"> = await </w:t>
-            </w:r>
-            <w:proofErr w:type="spellStart"/>
-            <w:r>
-              <w:t>Player.create</w:t>
-            </w:r>
-            <w:proofErr w:type="spellEnd"/>
-            <w:r>
-              <w:t>({</w:t>
-            </w:r>
-          </w:p>
-          <w:p>
-            <w:r>
-              <w:t xml:space="preserve">            </w:t>
-            </w:r>
-            <w:proofErr w:type="spellStart"/>
-            <w:r>
-              <w:t>player_name</w:t>
-            </w:r>
-            <w:proofErr w:type="spellEnd"/>
-            <w:r>
-              <w:t xml:space="preserve">: </w:t>
-            </w:r>
-            <w:proofErr w:type="spellStart"/>
-            <w:r>
-              <w:t>player_name</w:t>
-            </w:r>
-            <w:proofErr w:type="spellEnd"/>
-            <w:r>
-              <w:t>,</w:t>
-            </w:r>
-          </w:p>
-          <w:p>
-            <w:r>
-              <w:t>            score: score</w:t>
-            </w:r>
-          </w:p>
-          <w:p>
-            <w:r>
-              <w:t>        })</w:t>
-            </w:r>
-          </w:p>
-          <w:p/>
-          <w:p>
-            <w:r>
-              <w:t xml:space="preserve">        </w:t>
-            </w:r>
-            <w:proofErr w:type="spellStart"/>
-            <w:proofErr w:type="gramStart"/>
-            <w:r>
-              <w:t>res.status</w:t>
-            </w:r>
-            <w:proofErr w:type="spellEnd"/>
-            <w:proofErr w:type="gramEnd"/>
-            <w:r>
-              <w:t>(201</w:t>
-            </w:r>
-            <w:proofErr w:type="gramStart"/>
-            <w:r>
-              <w:t>).</w:t>
-            </w:r>
-            <w:proofErr w:type="spellStart"/>
-            <w:r>
-              <w:t>json</w:t>
-            </w:r>
-            <w:proofErr w:type="spellEnd"/>
-            <w:proofErr w:type="gramEnd"/>
-            <w:r>
-              <w:t>(</w:t>
-            </w:r>
-            <w:proofErr w:type="spellStart"/>
-            <w:r>
-              <w:t>createdPlayer</w:t>
-            </w:r>
-            <w:proofErr w:type="spellEnd"/>
-            <w:r>
-              <w:t>);</w:t>
-            </w:r>
-          </w:p>
-          <w:p/>
-          <w:p>
-            <w:r>
-              <w:t>    } catch (error) {</w:t>
-            </w:r>
-          </w:p>
-          <w:p>
-            <w:r>
-              <w:t xml:space="preserve">        </w:t>
-            </w:r>
-            <w:proofErr w:type="spellStart"/>
-            <w:proofErr w:type="gramStart"/>
-            <w:r>
-              <w:t>res.status</w:t>
-            </w:r>
-            <w:proofErr w:type="spellEnd"/>
-            <w:proofErr w:type="gramEnd"/>
-            <w:r>
-              <w:t>(500</w:t>
-            </w:r>
-            <w:proofErr w:type="gramStart"/>
-            <w:r>
-              <w:t>).</w:t>
-            </w:r>
-            <w:proofErr w:type="spellStart"/>
-            <w:r>
-              <w:t>json</w:t>
-            </w:r>
-            <w:proofErr w:type="spellEnd"/>
-            <w:r>
-              <w:t>({ message</w:t>
-            </w:r>
-            <w:proofErr w:type="gramEnd"/>
-            <w:r>
-              <w:t xml:space="preserve">: </w:t>
-            </w:r>
-            <w:proofErr w:type="spellStart"/>
-            <w:proofErr w:type="gramStart"/>
-            <w:r>
-              <w:t>error.message</w:t>
-            </w:r>
-            <w:proofErr w:type="spellEnd"/>
-            <w:proofErr w:type="gramEnd"/>
             <w:r>
               <w:t xml:space="preserve"> });</w:t>
             </w:r>
@@ -11449,7 +10929,7 @@
                     <pic:cNvPicPr/>
                   </pic:nvPicPr>
                   <pic:blipFill>
-                    <a:blip r:embed="rId19">
+                    <a:blip r:embed="rId21">
                       <a:extLst>
                         <a:ext uri="{28A0092B-C50C-407E-A947-70E740481C1C}">
                           <a14:useLocalDpi xmlns:a14="http://schemas.microsoft.com/office/drawing/2010/main" val="0"/>
@@ -11538,7 +11018,7 @@
                     <pic:cNvPicPr/>
                   </pic:nvPicPr>
                   <pic:blipFill>
-                    <a:blip r:embed="rId20">
+                    <a:blip r:embed="rId22">
                       <a:extLst>
                         <a:ext uri="{28A0092B-C50C-407E-A947-70E740481C1C}">
                           <a14:useLocalDpi xmlns:a14="http://schemas.microsoft.com/office/drawing/2010/main" val="0"/>
@@ -11697,7 +11177,7 @@
                     <pic:cNvPicPr/>
                   </pic:nvPicPr>
                   <pic:blipFill>
-                    <a:blip r:embed="rId21" cstate="print">
+                    <a:blip r:embed="rId23" cstate="print">
                       <a:extLst>
                         <a:ext uri="{28A0092B-C50C-407E-A947-70E740481C1C}">
                           <a14:useLocalDpi xmlns:a14="http://schemas.microsoft.com/office/drawing/2010/main" val="0"/>
@@ -11976,7 +11456,7 @@
                     <pic:cNvPicPr/>
                   </pic:nvPicPr>
                   <pic:blipFill>
-                    <a:blip r:embed="rId22" cstate="print">
+                    <a:blip r:embed="rId24" cstate="print">
                       <a:extLst>
                         <a:ext uri="{28A0092B-C50C-407E-A947-70E740481C1C}">
                           <a14:useLocalDpi xmlns:a14="http://schemas.microsoft.com/office/drawing/2010/main" val="0"/>
@@ -12155,7 +11635,7 @@
                     <pic:cNvPicPr/>
                   </pic:nvPicPr>
                   <pic:blipFill>
-                    <a:blip r:embed="rId23">
+                    <a:blip r:embed="rId25">
                       <a:extLst>
                         <a:ext uri="{28A0092B-C50C-407E-A947-70E740481C1C}">
                           <a14:useLocalDpi xmlns:a14="http://schemas.microsoft.com/office/drawing/2010/main" val="0"/>
@@ -12201,7 +11681,7 @@
                     <pic:cNvPicPr/>
                   </pic:nvPicPr>
                   <pic:blipFill>
-                    <a:blip r:embed="rId24">
+                    <a:blip r:embed="rId26">
                       <a:extLst>
                         <a:ext uri="{28A0092B-C50C-407E-A947-70E740481C1C}">
                           <a14:useLocalDpi xmlns:a14="http://schemas.microsoft.com/office/drawing/2010/main" val="0"/>
@@ -12247,7 +11727,7 @@
                     <pic:cNvPicPr/>
                   </pic:nvPicPr>
                   <pic:blipFill>
-                    <a:blip r:embed="rId25">
+                    <a:blip r:embed="rId27">
                       <a:extLst>
                         <a:ext uri="{28A0092B-C50C-407E-A947-70E740481C1C}">
                           <a14:useLocalDpi xmlns:a14="http://schemas.microsoft.com/office/drawing/2010/main" val="0"/>
@@ -12317,7 +11797,7 @@
                     <pic:cNvPicPr/>
                   </pic:nvPicPr>
                   <pic:blipFill>
-                    <a:blip r:embed="rId26">
+                    <a:blip r:embed="rId28">
                       <a:extLst>
                         <a:ext uri="{28A0092B-C50C-407E-A947-70E740481C1C}">
                           <a14:useLocalDpi xmlns:a14="http://schemas.microsoft.com/office/drawing/2010/main" val="0"/>
@@ -12535,7 +12015,7 @@
                     <pic:cNvPicPr/>
                   </pic:nvPicPr>
                   <pic:blipFill>
-                    <a:blip r:embed="rId27" cstate="print">
+                    <a:blip r:embed="rId29" cstate="print">
                       <a:extLst>
                         <a:ext uri="{28A0092B-C50C-407E-A947-70E740481C1C}">
                           <a14:useLocalDpi xmlns:a14="http://schemas.microsoft.com/office/drawing/2010/main" val="0"/>
@@ -12647,7 +12127,7 @@
                     <pic:cNvPicPr/>
                   </pic:nvPicPr>
                   <pic:blipFill>
-                    <a:blip r:embed="rId28">
+                    <a:blip r:embed="rId30">
                       <a:extLst>
                         <a:ext uri="{28A0092B-C50C-407E-A947-70E740481C1C}">
                           <a14:useLocalDpi xmlns:a14="http://schemas.microsoft.com/office/drawing/2010/main" val="0"/>
@@ -12711,7 +12191,7 @@
                     <pic:cNvPicPr/>
                   </pic:nvPicPr>
                   <pic:blipFill>
-                    <a:blip r:embed="rId29">
+                    <a:blip r:embed="rId31">
                       <a:extLst>
                         <a:ext uri="{28A0092B-C50C-407E-A947-70E740481C1C}">
                           <a14:useLocalDpi xmlns:a14="http://schemas.microsoft.com/office/drawing/2010/main" val="0"/>
@@ -12786,7 +12266,7 @@
           <w:noProof/>
         </w:rPr>
         <w:drawing>
-          <wp:inline distT="0" distB="0" distL="0" distR="0" wp14:anchorId="6555D412" wp14:editId="397566CF">
+          <wp:inline distT="0" distB="0" distL="0" distR="0" wp14:anchorId="6555D412" wp14:editId="54A7F895">
             <wp:extent cx="5731510" cy="2953385"/>
             <wp:effectExtent l="0" t="0" r="2540" b="0"/>
             <wp:docPr id="2137158668" name="Picture 9"/>
@@ -12801,7 +12281,7 @@
                     <pic:cNvPicPr/>
                   </pic:nvPicPr>
                   <pic:blipFill>
-                    <a:blip r:embed="rId30" cstate="print">
+                    <a:blip r:embed="rId32" cstate="print">
                       <a:extLst>
                         <a:ext uri="{28A0092B-C50C-407E-A947-70E740481C1C}">
                           <a14:useLocalDpi xmlns:a14="http://schemas.microsoft.com/office/drawing/2010/main" val="0"/>
@@ -13339,7 +12819,7 @@
                     <pic:cNvPicPr/>
                   </pic:nvPicPr>
                   <pic:blipFill>
-                    <a:blip r:embed="rId31" cstate="print">
+                    <a:blip r:embed="rId33" cstate="print">
                       <a:extLst>
                         <a:ext uri="{28A0092B-C50C-407E-A947-70E740481C1C}">
                           <a14:useLocalDpi xmlns:a14="http://schemas.microsoft.com/office/drawing/2010/main" val="0"/>
@@ -13484,7 +12964,7 @@
                     <pic:cNvPicPr/>
                   </pic:nvPicPr>
                   <pic:blipFill>
-                    <a:blip r:embed="rId32" cstate="print">
+                    <a:blip r:embed="rId34" cstate="print">
                       <a:extLst>
                         <a:ext uri="{28A0092B-C50C-407E-A947-70E740481C1C}">
                           <a14:useLocalDpi xmlns:a14="http://schemas.microsoft.com/office/drawing/2010/main" val="0"/>
@@ -13766,19 +13246,11 @@
             </w:r>
             <w:proofErr w:type="spellStart"/>
             <w:r>
-              <w:t>get_data_for_</w:t>
-            </w:r>
-            <w:proofErr w:type="gramStart"/>
-            <w:r>
-              <w:t>save</w:t>
+              <w:t>get_data_for_save</w:t>
             </w:r>
             <w:proofErr w:type="spellEnd"/>
             <w:r>
-              <w:t>(</w:t>
-            </w:r>
-            <w:proofErr w:type="gramEnd"/>
-            <w:r>
-              <w:t>) -&gt; Dictionary:</w:t>
+              <w:t>() -&gt; Dictionary:</w:t>
             </w:r>
           </w:p>
           <w:p>
@@ -13796,13 +13268,8 @@
               <w:t>"</w:t>
             </w:r>
             <w:proofErr w:type="spellStart"/>
-            <w:proofErr w:type="gramStart"/>
-            <w:r>
-              <w:t>player</w:t>
-            </w:r>
-            <w:proofErr w:type="gramEnd"/>
-            <w:r>
-              <w:t>_name</w:t>
+            <w:r>
+              <w:t>player_name</w:t>
             </w:r>
             <w:proofErr w:type="spellEnd"/>
             <w:r>
@@ -13826,13 +13293,8 @@
               <w:t>"</w:t>
             </w:r>
             <w:proofErr w:type="spellStart"/>
-            <w:proofErr w:type="gramStart"/>
-            <w:r>
-              <w:t>player</w:t>
-            </w:r>
-            <w:proofErr w:type="gramEnd"/>
-            <w:r>
-              <w:t>_email_username</w:t>
+            <w:r>
+              <w:t>player_email_username</w:t>
             </w:r>
             <w:proofErr w:type="spellEnd"/>
             <w:r>
@@ -13903,19 +13365,11 @@
             </w:r>
             <w:proofErr w:type="spellStart"/>
             <w:r>
-              <w:t>save_</w:t>
-            </w:r>
-            <w:proofErr w:type="gramStart"/>
-            <w:r>
-              <w:t>game</w:t>
+              <w:t>save_game</w:t>
             </w:r>
             <w:proofErr w:type="spellEnd"/>
             <w:r>
-              <w:t>(</w:t>
-            </w:r>
-            <w:proofErr w:type="gramEnd"/>
-            <w:r>
-              <w:t>) -&gt; void:</w:t>
+              <w:t>() -&gt; void:</w:t>
             </w:r>
           </w:p>
           <w:p>
@@ -13925,19 +13379,11 @@
             </w:r>
             <w:proofErr w:type="spellStart"/>
             <w:r>
-              <w:t>save_</w:t>
-            </w:r>
-            <w:proofErr w:type="gramStart"/>
-            <w:r>
-              <w:t>data</w:t>
+              <w:t>save_data</w:t>
             </w:r>
             <w:proofErr w:type="spellEnd"/>
             <w:r>
-              <w:t xml:space="preserve"> :</w:t>
-            </w:r>
-            <w:proofErr w:type="gramEnd"/>
-            <w:r>
-              <w:t>= {</w:t>
+              <w:t xml:space="preserve"> := {</w:t>
             </w:r>
           </w:p>
           <w:p>
@@ -13949,13 +13395,8 @@
               <w:t>"</w:t>
             </w:r>
             <w:proofErr w:type="spellStart"/>
-            <w:proofErr w:type="gramStart"/>
-            <w:r>
-              <w:t>player</w:t>
-            </w:r>
-            <w:proofErr w:type="gramEnd"/>
-            <w:r>
-              <w:t>_info</w:t>
+            <w:r>
+              <w:t>player_info</w:t>
             </w:r>
             <w:proofErr w:type="spellEnd"/>
             <w:r>
@@ -13963,19 +13404,11 @@
             </w:r>
             <w:proofErr w:type="spellStart"/>
             <w:r>
-              <w:t>GameManagerInstance.get_data_for_</w:t>
-            </w:r>
-            <w:proofErr w:type="gramStart"/>
-            <w:r>
-              <w:t>save</w:t>
+              <w:t>GameManagerInstance.get_data_for_save</w:t>
             </w:r>
             <w:proofErr w:type="spellEnd"/>
             <w:r>
-              <w:t>(</w:t>
-            </w:r>
-            <w:proofErr w:type="gramEnd"/>
-            <w:r>
-              <w:t>),</w:t>
+              <w:t>(),</w:t>
             </w:r>
           </w:p>
           <w:p>
@@ -13987,13 +13420,8 @@
               <w:t>"</w:t>
             </w:r>
             <w:proofErr w:type="spellStart"/>
-            <w:proofErr w:type="gramStart"/>
-            <w:r>
-              <w:t>level</w:t>
-            </w:r>
-            <w:proofErr w:type="gramEnd"/>
-            <w:r>
-              <w:t>_info</w:t>
+            <w:r>
+              <w:t>level_info</w:t>
             </w:r>
             <w:proofErr w:type="spellEnd"/>
             <w:r>
@@ -14001,19 +13429,11 @@
             </w:r>
             <w:proofErr w:type="spellStart"/>
             <w:r>
-              <w:t>LevelServiceInstance.get_data_for_</w:t>
-            </w:r>
-            <w:proofErr w:type="gramStart"/>
-            <w:r>
-              <w:t>save</w:t>
+              <w:t>LevelServiceInstance.get_data_for_save</w:t>
             </w:r>
             <w:proofErr w:type="spellEnd"/>
             <w:r>
-              <w:t>(</w:t>
-            </w:r>
-            <w:proofErr w:type="gramEnd"/>
-            <w:r>
-              <w:t>),</w:t>
+              <w:t>(),</w:t>
             </w:r>
           </w:p>
           <w:p>
@@ -14025,13 +13445,8 @@
               <w:t>"</w:t>
             </w:r>
             <w:proofErr w:type="spellStart"/>
-            <w:proofErr w:type="gramStart"/>
-            <w:r>
-              <w:t>player</w:t>
-            </w:r>
-            <w:proofErr w:type="gramEnd"/>
-            <w:r>
-              <w:t>_emails</w:t>
+            <w:r>
+              <w:t>player_emails</w:t>
             </w:r>
             <w:proofErr w:type="spellEnd"/>
             <w:r>
@@ -14039,19 +13454,11 @@
             </w:r>
             <w:proofErr w:type="spellStart"/>
             <w:r>
-              <w:t>EmailServiceInstance.get_data_for_</w:t>
-            </w:r>
-            <w:proofErr w:type="gramStart"/>
-            <w:r>
-              <w:t>save</w:t>
+              <w:t>EmailServiceInstance.get_data_for_save</w:t>
             </w:r>
             <w:proofErr w:type="spellEnd"/>
             <w:r>
-              <w:t>(</w:t>
-            </w:r>
-            <w:proofErr w:type="gramEnd"/>
-            <w:r>
-              <w:t>),</w:t>
+              <w:t>(),</w:t>
             </w:r>
           </w:p>
           <w:p>
@@ -14063,13 +13470,8 @@
               <w:t>"</w:t>
             </w:r>
             <w:proofErr w:type="spellStart"/>
-            <w:proofErr w:type="gramStart"/>
-            <w:r>
-              <w:t>player</w:t>
-            </w:r>
-            <w:proofErr w:type="gramEnd"/>
-            <w:r>
-              <w:t>_files</w:t>
+            <w:r>
+              <w:t>player_files</w:t>
             </w:r>
             <w:proofErr w:type="spellEnd"/>
             <w:r>
@@ -14077,19 +13479,11 @@
             </w:r>
             <w:proofErr w:type="spellStart"/>
             <w:r>
-              <w:t>FileServiceInstance.get_data_for_</w:t>
-            </w:r>
-            <w:proofErr w:type="gramStart"/>
-            <w:r>
-              <w:t>save</w:t>
+              <w:t>FileServiceInstance.get_data_for_save</w:t>
             </w:r>
             <w:proofErr w:type="spellEnd"/>
             <w:r>
-              <w:t>(</w:t>
-            </w:r>
-            <w:proofErr w:type="gramEnd"/>
-            <w:r>
-              <w:t>)</w:t>
+              <w:t>()</w:t>
             </w:r>
           </w:p>
           <w:p>
@@ -14138,24 +13532,14 @@
               <w:tab/>
             </w:r>
             <w:proofErr w:type="spellStart"/>
-            <w:proofErr w:type="gramStart"/>
-            <w:r>
-              <w:t>file.store</w:t>
-            </w:r>
-            <w:proofErr w:type="gramEnd"/>
-            <w:r>
-              <w:t>_</w:t>
-            </w:r>
-            <w:proofErr w:type="gramStart"/>
-            <w:r>
-              <w:t>string</w:t>
+            <w:r>
+              <w:t>file.store_string</w:t>
             </w:r>
             <w:proofErr w:type="spellEnd"/>
             <w:r>
               <w:t>(</w:t>
             </w:r>
             <w:proofErr w:type="spellStart"/>
-            <w:proofErr w:type="gramEnd"/>
             <w:r>
               <w:t>JSON.stringify</w:t>
             </w:r>
@@ -14177,12 +13561,10 @@
               <w:tab/>
             </w:r>
             <w:proofErr w:type="spellStart"/>
-            <w:proofErr w:type="gramStart"/>
             <w:r>
               <w:t>file.close</w:t>
             </w:r>
             <w:proofErr w:type="spellEnd"/>
-            <w:proofErr w:type="gramEnd"/>
             <w:r>
               <w:t>()</w:t>
             </w:r>
@@ -14465,7 +13847,7 @@
                     <pic:cNvPicPr/>
                   </pic:nvPicPr>
                   <pic:blipFill>
-                    <a:blip r:embed="rId33" cstate="print">
+                    <a:blip r:embed="rId35" cstate="print">
                       <a:extLst>
                         <a:ext uri="{28A0092B-C50C-407E-A947-70E740481C1C}">
                           <a14:useLocalDpi xmlns:a14="http://schemas.microsoft.com/office/drawing/2010/main" val="0"/>
@@ -15133,7 +14515,7 @@
       <w:r>
         <w:t xml:space="preserve">: </w:t>
       </w:r>
-      <w:hyperlink r:id="rId34" w:history="1">
+      <w:hyperlink r:id="rId36" w:history="1">
         <w:r>
           <w:rPr>
             <w:rStyle w:val="Hyperlink"/>
@@ -15192,7 +14574,7 @@
       <w:r>
         <w:t xml:space="preserve">: </w:t>
       </w:r>
-      <w:hyperlink r:id="rId35" w:history="1">
+      <w:hyperlink r:id="rId37" w:history="1">
         <w:r>
           <w:rPr>
             <w:rStyle w:val="Hyperlink"/>
@@ -15245,7 +14627,7 @@
       <w:r>
         <w:t xml:space="preserve">: </w:t>
       </w:r>
-      <w:hyperlink r:id="rId36" w:history="1">
+      <w:hyperlink r:id="rId38" w:history="1">
         <w:r>
           <w:rPr>
             <w:rStyle w:val="Hyperlink"/>
@@ -15290,7 +14672,7 @@
       <w:r>
         <w:t xml:space="preserve">: </w:t>
       </w:r>
-      <w:hyperlink r:id="rId37" w:history="1">
+      <w:hyperlink r:id="rId39" w:history="1">
         <w:r>
           <w:rPr>
             <w:rStyle w:val="Hyperlink"/>
@@ -15348,7 +14730,7 @@
       <w:r>
         <w:t xml:space="preserve">: </w:t>
       </w:r>
-      <w:hyperlink r:id="rId38" w:history="1">
+      <w:hyperlink r:id="rId40" w:history="1">
         <w:r>
           <w:rPr>
             <w:rStyle w:val="Hyperlink"/>
@@ -15412,7 +14794,7 @@
       <w:r>
         <w:t xml:space="preserve">: </w:t>
       </w:r>
-      <w:hyperlink r:id="rId39" w:history="1">
+      <w:hyperlink r:id="rId41" w:history="1">
         <w:r>
           <w:rPr>
             <w:rStyle w:val="Hyperlink"/>
@@ -15469,7 +14851,7 @@
       <w:r>
         <w:t xml:space="preserve"> </w:t>
       </w:r>
-      <w:hyperlink r:id="rId40" w:history="1">
+      <w:hyperlink r:id="rId42" w:history="1">
         <w:r>
           <w:rPr>
             <w:rStyle w:val="Hyperlink"/>
@@ -15514,7 +14896,7 @@
       <w:r>
         <w:t xml:space="preserve">. Available at: </w:t>
       </w:r>
-      <w:hyperlink r:id="rId41" w:history="1">
+      <w:hyperlink r:id="rId43" w:history="1">
         <w:r>
           <w:rPr>
             <w:rStyle w:val="Hyperlink"/>
@@ -15583,7 +14965,7 @@
                     <pic:cNvPicPr/>
                   </pic:nvPicPr>
                   <pic:blipFill>
-                    <a:blip r:embed="rId42" cstate="print">
+                    <a:blip r:embed="rId44" cstate="print">
                       <a:extLst>
                         <a:ext uri="{28A0092B-C50C-407E-A947-70E740481C1C}">
                           <a14:useLocalDpi xmlns:a14="http://schemas.microsoft.com/office/drawing/2010/main" val="0"/>
@@ -15611,7 +14993,7 @@
       </w:r>
     </w:p>
     <w:p>
-      <w:hyperlink r:id="rId43" w:anchor="fromView=search&amp;page=1&amp;position=12&amp;uuid=32af1e59-aaa6-4fe3-af7b-bd10d6326bb6&amp;query=stationery" w:history="1">
+      <w:hyperlink r:id="rId45" w:anchor="fromView=search&amp;page=1&amp;position=12&amp;uuid=32af1e59-aaa6-4fe3-af7b-bd10d6326bb6&amp;query=stationery" w:history="1">
         <w:r>
           <w:rPr>
             <w:rStyle w:val="Hyperlink"/>
@@ -15645,7 +15027,7 @@
                     <pic:cNvPicPr/>
                   </pic:nvPicPr>
                   <pic:blipFill>
-                    <a:blip r:embed="rId44" cstate="print">
+                    <a:blip r:embed="rId46" cstate="print">
                       <a:extLst>
                         <a:ext uri="{28A0092B-C50C-407E-A947-70E740481C1C}">
                           <a14:useLocalDpi xmlns:a14="http://schemas.microsoft.com/office/drawing/2010/main" val="0"/>
@@ -15673,7 +15055,7 @@
       </w:r>
     </w:p>
     <w:p>
-      <w:hyperlink r:id="rId45" w:anchor="fromView=search&amp;page=1&amp;position=4&amp;uuid=842b97ad-5473-417d-be5d-302a73297623&amp;query=arm+cross+corporate+group" w:history="1">
+      <w:hyperlink r:id="rId47" w:anchor="fromView=search&amp;page=1&amp;position=4&amp;uuid=842b97ad-5473-417d-be5d-302a73297623&amp;query=arm+cross+corporate+group" w:history="1">
         <w:r>
           <w:rPr>
             <w:rStyle w:val="Hyperlink"/>
@@ -15701,7 +15083,7 @@
       </w:r>
     </w:p>
     <w:p>
-      <w:hyperlink r:id="rId46" w:history="1">
+      <w:hyperlink r:id="rId48" w:history="1">
         <w:r>
           <w:rPr>
             <w:rStyle w:val="Hyperlink"/>
@@ -15763,7 +15145,7 @@
                           <pic:cNvPicPr/>
                         </pic:nvPicPr>
                         <pic:blipFill>
-                          <a:blip r:embed="rId47">
+                          <a:blip r:embed="rId49">
                             <a:extLst>
                               <a:ext uri="{28A0092B-C50C-407E-A947-70E740481C1C}">
                                 <a14:useLocalDpi xmlns:a14="http://schemas.microsoft.com/office/drawing/2010/main" val="0"/>
@@ -15856,7 +15238,7 @@
                           <pic:cNvPicPr/>
                         </pic:nvPicPr>
                         <pic:blipFill>
-                          <a:blip r:embed="rId48">
+                          <a:blip r:embed="rId50">
                             <a:extLst>
                               <a:ext uri="{28A0092B-C50C-407E-A947-70E740481C1C}">
                                 <a14:useLocalDpi xmlns:a14="http://schemas.microsoft.com/office/drawing/2010/main" val="0"/>
@@ -15909,7 +15291,7 @@
               </w:rPr>
               <w:lastRenderedPageBreak/>
               <w:drawing>
-                <wp:inline distT="0" distB="0" distL="0" distR="0" wp14:anchorId="6E84EB0D" wp14:editId="76D3E141">
+                <wp:inline distT="0" distB="0" distL="0" distR="0" wp14:anchorId="6E84EB0D" wp14:editId="584470CB">
                   <wp:extent cx="4038823" cy="2865120"/>
                   <wp:effectExtent l="0" t="0" r="0" b="0"/>
                   <wp:docPr id="77576948" name="Picture 8"/>
@@ -15924,7 +15306,7 @@
                           <pic:cNvPicPr/>
                         </pic:nvPicPr>
                         <pic:blipFill>
-                          <a:blip r:embed="rId49" cstate="print">
+                          <a:blip r:embed="rId51" cstate="print">
                             <a:extLst>
                               <a:ext uri="{28A0092B-C50C-407E-A947-70E740481C1C}">
                                 <a14:useLocalDpi xmlns:a14="http://schemas.microsoft.com/office/drawing/2010/main" val="0"/>
@@ -16001,7 +15383,7 @@
                           <pic:cNvPicPr/>
                         </pic:nvPicPr>
                         <pic:blipFill>
-                          <a:blip r:embed="rId50">
+                          <a:blip r:embed="rId52">
                             <a:extLst>
                               <a:ext uri="{28A0092B-C50C-407E-A947-70E740481C1C}">
                                 <a14:useLocalDpi xmlns:a14="http://schemas.microsoft.com/office/drawing/2010/main" val="0"/>
@@ -16067,7 +15449,7 @@
                     <pic:cNvPicPr/>
                   </pic:nvPicPr>
                   <pic:blipFill>
-                    <a:blip r:embed="rId51" cstate="print">
+                    <a:blip r:embed="rId53" cstate="print">
                       <a:extLst>
                         <a:ext uri="{28A0092B-C50C-407E-A947-70E740481C1C}">
                           <a14:useLocalDpi xmlns:a14="http://schemas.microsoft.com/office/drawing/2010/main" val="0"/>
@@ -16106,7 +15488,7 @@
       </w:r>
     </w:p>
     <w:sectPr>
-      <w:footerReference w:type="default" r:id="rId52"/>
+      <w:footerReference w:type="default" r:id="rId54"/>
       <w:pgSz w:w="11906" w:h="16838"/>
       <w:pgMar w:top="1440" w:right="1440" w:bottom="1440" w:left="1440" w:header="708" w:footer="708" w:gutter="0"/>
       <w:cols w:space="708"/>

</xml_diff>